<commit_message>
Updated Version of the Test Strategy
</commit_message>
<xml_diff>
--- a/MANUAL TESTING PROJECT - University Student Portal/Exercise 1-Test Strategy.docx
+++ b/MANUAL TESTING PROJECT - University Student Portal/Exercise 1-Test Strategy.docx
@@ -2,25 +2,1164 @@
 <file path=word/document.xml><?xml version="1.0" encoding="utf-8"?>
 <w:document xmlns:wpc="http://schemas.microsoft.com/office/word/2010/wordprocessingCanvas" xmlns:cx="http://schemas.microsoft.com/office/drawing/2014/chartex" xmlns:cx1="http://schemas.microsoft.com/office/drawing/2015/9/8/chartex" xmlns:cx2="http://schemas.microsoft.com/office/drawing/2015/10/21/chartex" xmlns:cx3="http://schemas.microsoft.com/office/drawing/2016/5/9/chartex" xmlns:cx4="http://schemas.microsoft.com/office/drawing/2016/5/10/chartex" xmlns:cx5="http://schemas.microsoft.com/office/drawing/2016/5/11/chartex" xmlns:cx6="http://schemas.microsoft.com/office/drawing/2016/5/12/chartex" xmlns:cx7="http://schemas.microsoft.com/office/drawing/2016/5/13/chartex" xmlns:cx8="http://schemas.microsoft.com/office/drawing/2016/5/14/chartex" xmlns:mc="http://schemas.openxmlformats.org/markup-compatibility/2006" xmlns:aink="http://schemas.microsoft.com/office/drawing/2016/ink" xmlns:am3d="http://schemas.microsoft.com/office/drawing/2017/model3d" xmlns:o="urn:schemas-microsoft-com:office:office" xmlns:oel="http://schemas.microsoft.com/office/2019/extlst" xmlns:r="http://schemas.openxmlformats.org/officeDocument/2006/relationships" xmlns:m="http://schemas.openxmlformats.org/officeDocument/2006/math" xmlns:v="urn:schemas-microsoft-com:vml" xmlns:wp14="http://schemas.microsoft.com/office/word/2010/wordprocessingDrawing" xmlns:wp="http://schemas.openxmlformats.org/drawingml/2006/wordprocessingDrawing" xmlns:w10="urn:schemas-microsoft-com:office:word" xmlns:w="http://schemas.openxmlformats.org/wordprocessingml/2006/main" xmlns:w14="http://schemas.microsoft.com/office/word/2010/wordml" xmlns:w15="http://schemas.microsoft.com/office/word/2012/wordml" xmlns:w16cex="http://schemas.microsoft.com/office/word/2018/wordml/cex" xmlns:w16cid="http://schemas.microsoft.com/office/word/2016/wordml/cid" xmlns:w16="http://schemas.microsoft.com/office/word/2018/wordml" xmlns:w16du="http://schemas.microsoft.com/office/word/2023/wordml/word16du" xmlns:w16sdtdh="http://schemas.microsoft.com/office/word/2020/wordml/sdtdatahash" xmlns:w16sdtfl="http://schemas.microsoft.com/office/word/2024/wordml/sdtformatlock" xmlns:w16se="http://schemas.microsoft.com/office/word/2015/wordml/symex" xmlns:wpg="http://schemas.microsoft.com/office/word/2010/wordprocessingGroup" xmlns:wpi="http://schemas.microsoft.com/office/word/2010/wordprocessingInk" xmlns:wne="http://schemas.microsoft.com/office/word/2006/wordml" xmlns:wps="http://schemas.microsoft.com/office/word/2010/wordprocessingShape" mc:Ignorable="w14 w15 w16se w16cid w16 w16cex w16sdtdh w16sdtfl w16du wp14">
   <w:body>
-    <w:p>
-      <w:r>
+    <w:sdt>
+      <w:sdtPr>
+        <w:id w:val="1611401534"/>
+        <w:docPartObj>
+          <w:docPartGallery w:val="Cover Pages"/>
+          <w:docPartUnique/>
+        </w:docPartObj>
+      </w:sdtPr>
+      <w:sdtEndPr>
         <w:rPr>
           <w:u w:val="single"/>
         </w:rPr>
-        <w:t>Exercise 1 – Create a test strategy document for the portal</w:t>
-      </w:r>
-      <w:r>
-        <w:t>.</w:t>
-      </w:r>
-    </w:p>
-    <w:p>
-      <w:r>
-        <w:t>The University Student Portal is a web-based portal that allows students to do a variety of tasks that are associated with enrolment as well as observing the progress they have made in the courses they are enrolled in.</w:t>
-      </w:r>
-    </w:p>
-    <w:p>
-      <w:r>
-        <w:t>System Overview:</w:t>
+      </w:sdtEndPr>
+      <w:sdtContent>
+        <w:p/>
+        <w:p>
+          <w:pPr>
+            <w:rPr>
+              <w:u w:val="single"/>
+            </w:rPr>
+          </w:pPr>
+          <w:r>
+            <w:rPr>
+              <w:noProof/>
+            </w:rPr>
+            <mc:AlternateContent>
+              <mc:Choice Requires="wpg">
+                <w:drawing>
+                  <wp:anchor distT="0" distB="0" distL="114300" distR="114300" simplePos="0" relativeHeight="251659264" behindDoc="1" locked="0" layoutInCell="1" allowOverlap="1" wp14:anchorId="0DE67124" wp14:editId="5C8F1D89">
+                    <wp:simplePos x="0" y="0"/>
+                    <wp:positionH relativeFrom="margin">
+                      <wp:align>center</wp:align>
+                    </wp:positionH>
+                    <mc:AlternateContent>
+                      <mc:Choice Requires="wp14">
+                        <wp:positionV relativeFrom="page">
+                          <wp14:pctPosVOffset>4500</wp14:pctPosVOffset>
+                        </wp:positionV>
+                      </mc:Choice>
+                      <mc:Fallback>
+                        <wp:positionV relativeFrom="page">
+                          <wp:posOffset>480695</wp:posOffset>
+                        </wp:positionV>
+                      </mc:Fallback>
+                    </mc:AlternateContent>
+                    <wp:extent cx="6858000" cy="7068185"/>
+                    <wp:effectExtent l="0" t="0" r="0" b="0"/>
+                    <wp:wrapNone/>
+                    <wp:docPr id="125" name="Group 126"/>
+                    <wp:cNvGraphicFramePr>
+                      <a:graphicFrameLocks xmlns:a="http://schemas.openxmlformats.org/drawingml/2006/main" noChangeAspect="1"/>
+                    </wp:cNvGraphicFramePr>
+                    <a:graphic xmlns:a="http://schemas.openxmlformats.org/drawingml/2006/main">
+                      <a:graphicData uri="http://schemas.microsoft.com/office/word/2010/wordprocessingGroup">
+                        <wpg:wgp>
+                          <wpg:cNvGrpSpPr>
+                            <a:grpSpLocks noChangeAspect="1"/>
+                          </wpg:cNvGrpSpPr>
+                          <wpg:grpSpPr>
+                            <a:xfrm>
+                              <a:off x="0" y="0"/>
+                              <a:ext cx="6858000" cy="7068312"/>
+                              <a:chOff x="0" y="0"/>
+                              <a:chExt cx="5561330" cy="5404485"/>
+                            </a:xfrm>
+                          </wpg:grpSpPr>
+                          <wps:wsp>
+                            <wps:cNvPr id="126" name="Freeform 10"/>
+                            <wps:cNvSpPr>
+                              <a:spLocks/>
+                            </wps:cNvSpPr>
+                            <wps:spPr bwMode="auto">
+                              <a:xfrm>
+                                <a:off x="0" y="0"/>
+                                <a:ext cx="5557520" cy="5404485"/>
+                              </a:xfrm>
+                              <a:custGeom>
+                                <a:avLst/>
+                                <a:gdLst>
+                                  <a:gd name="T0" fmla="*/ 0 w 720"/>
+                                  <a:gd name="T1" fmla="*/ 0 h 700"/>
+                                  <a:gd name="T2" fmla="*/ 0 w 720"/>
+                                  <a:gd name="T3" fmla="*/ 644 h 700"/>
+                                  <a:gd name="T4" fmla="*/ 113 w 720"/>
+                                  <a:gd name="T5" fmla="*/ 665 h 700"/>
+                                  <a:gd name="T6" fmla="*/ 720 w 720"/>
+                                  <a:gd name="T7" fmla="*/ 644 h 700"/>
+                                  <a:gd name="T8" fmla="*/ 720 w 720"/>
+                                  <a:gd name="T9" fmla="*/ 617 h 700"/>
+                                  <a:gd name="T10" fmla="*/ 720 w 720"/>
+                                  <a:gd name="T11" fmla="*/ 0 h 700"/>
+                                  <a:gd name="T12" fmla="*/ 0 w 720"/>
+                                  <a:gd name="T13" fmla="*/ 0 h 700"/>
+                                </a:gdLst>
+                                <a:ahLst/>
+                                <a:cxnLst>
+                                  <a:cxn ang="0">
+                                    <a:pos x="T0" y="T1"/>
+                                  </a:cxn>
+                                  <a:cxn ang="0">
+                                    <a:pos x="T2" y="T3"/>
+                                  </a:cxn>
+                                  <a:cxn ang="0">
+                                    <a:pos x="T4" y="T5"/>
+                                  </a:cxn>
+                                  <a:cxn ang="0">
+                                    <a:pos x="T6" y="T7"/>
+                                  </a:cxn>
+                                  <a:cxn ang="0">
+                                    <a:pos x="T8" y="T9"/>
+                                  </a:cxn>
+                                  <a:cxn ang="0">
+                                    <a:pos x="T10" y="T11"/>
+                                  </a:cxn>
+                                  <a:cxn ang="0">
+                                    <a:pos x="T12" y="T13"/>
+                                  </a:cxn>
+                                </a:cxnLst>
+                                <a:rect l="0" t="0" r="r" b="b"/>
+                                <a:pathLst>
+                                  <a:path w="720" h="700">
+                                    <a:moveTo>
+                                      <a:pt x="0" y="0"/>
+                                    </a:moveTo>
+                                    <a:cubicBezTo>
+                                      <a:pt x="0" y="644"/>
+                                      <a:pt x="0" y="644"/>
+                                      <a:pt x="0" y="644"/>
+                                    </a:cubicBezTo>
+                                    <a:cubicBezTo>
+                                      <a:pt x="23" y="650"/>
+                                      <a:pt x="62" y="658"/>
+                                      <a:pt x="113" y="665"/>
+                                    </a:cubicBezTo>
+                                    <a:cubicBezTo>
+                                      <a:pt x="250" y="685"/>
+                                      <a:pt x="476" y="700"/>
+                                      <a:pt x="720" y="644"/>
+                                    </a:cubicBezTo>
+                                    <a:cubicBezTo>
+                                      <a:pt x="720" y="617"/>
+                                      <a:pt x="720" y="617"/>
+                                      <a:pt x="720" y="617"/>
+                                    </a:cubicBezTo>
+                                    <a:cubicBezTo>
+                                      <a:pt x="720" y="0"/>
+                                      <a:pt x="720" y="0"/>
+                                      <a:pt x="720" y="0"/>
+                                    </a:cubicBezTo>
+                                    <a:cubicBezTo>
+                                      <a:pt x="0" y="0"/>
+                                      <a:pt x="0" y="0"/>
+                                      <a:pt x="0" y="0"/>
+                                    </a:cubicBezTo>
+                                  </a:path>
+                                </a:pathLst>
+                              </a:custGeom>
+                              <a:ln>
+                                <a:noFill/>
+                              </a:ln>
+                            </wps:spPr>
+                            <wps:style>
+                              <a:lnRef idx="0">
+                                <a:scrgbClr r="0" g="0" b="0"/>
+                              </a:lnRef>
+                              <a:fillRef idx="1003">
+                                <a:schemeClr val="dk2"/>
+                              </a:fillRef>
+                              <a:effectRef idx="0">
+                                <a:scrgbClr r="0" g="0" b="0"/>
+                              </a:effectRef>
+                              <a:fontRef idx="major"/>
+                            </wps:style>
+                            <wps:txbx>
+                              <w:txbxContent>
+                                <w:p>
+                                  <w:pPr>
+                                    <w:rPr>
+                                      <w:color w:val="FFFFFF" w:themeColor="background1"/>
+                                      <w:sz w:val="56"/>
+                                      <w:szCs w:val="56"/>
+                                    </w:rPr>
+                                  </w:pPr>
+                                  <w:sdt>
+                                    <w:sdtPr>
+                                      <w:rPr>
+                                        <w:color w:val="FFFFFF" w:themeColor="background1"/>
+                                        <w:sz w:val="56"/>
+                                        <w:szCs w:val="56"/>
+                                      </w:rPr>
+                                      <w:alias w:val="Title"/>
+                                      <w:tag w:val=""/>
+                                      <w:id w:val="-554696155"/>
+                                      <w:dataBinding w:prefixMappings="xmlns:ns0='http://purl.org/dc/elements/1.1/' xmlns:ns1='http://schemas.openxmlformats.org/package/2006/metadata/core-properties' " w:xpath="/ns1:coreProperties[1]/ns0:title[1]" w:storeItemID="{6C3C8BC8-F283-45AE-878A-BAB7291924A1}"/>
+                                      <w:text/>
+                                    </w:sdtPr>
+                                    <w:sdtContent>
+                                      <w:r>
+                                        <w:rPr>
+                                          <w:color w:val="FFFFFF" w:themeColor="background1"/>
+                                          <w:sz w:val="56"/>
+                                          <w:szCs w:val="56"/>
+                                        </w:rPr>
+                                        <w:t>University Student Portal</w:t>
+                                      </w:r>
+                                    </w:sdtContent>
+                                  </w:sdt>
+                                </w:p>
+                              </w:txbxContent>
+                            </wps:txbx>
+                            <wps:bodyPr rot="0" vert="horz" wrap="square" lIns="914400" tIns="1097280" rIns="1097280" bIns="1097280" anchor="b" anchorCtr="0" upright="1">
+                              <a:noAutofit/>
+                            </wps:bodyPr>
+                          </wps:wsp>
+                          <wps:wsp>
+                            <wps:cNvPr id="127" name="Freeform 11"/>
+                            <wps:cNvSpPr>
+                              <a:spLocks/>
+                            </wps:cNvSpPr>
+                            <wps:spPr bwMode="auto">
+                              <a:xfrm>
+                                <a:off x="876300" y="4769783"/>
+                                <a:ext cx="4685030" cy="509905"/>
+                              </a:xfrm>
+                              <a:custGeom>
+                                <a:avLst/>
+                                <a:gdLst>
+                                  <a:gd name="T0" fmla="*/ 607 w 607"/>
+                                  <a:gd name="T1" fmla="*/ 0 h 66"/>
+                                  <a:gd name="T2" fmla="*/ 176 w 607"/>
+                                  <a:gd name="T3" fmla="*/ 57 h 66"/>
+                                  <a:gd name="T4" fmla="*/ 0 w 607"/>
+                                  <a:gd name="T5" fmla="*/ 48 h 66"/>
+                                  <a:gd name="T6" fmla="*/ 251 w 607"/>
+                                  <a:gd name="T7" fmla="*/ 66 h 66"/>
+                                  <a:gd name="T8" fmla="*/ 607 w 607"/>
+                                  <a:gd name="T9" fmla="*/ 27 h 66"/>
+                                  <a:gd name="T10" fmla="*/ 607 w 607"/>
+                                  <a:gd name="T11" fmla="*/ 0 h 66"/>
+                                </a:gdLst>
+                                <a:ahLst/>
+                                <a:cxnLst>
+                                  <a:cxn ang="0">
+                                    <a:pos x="T0" y="T1"/>
+                                  </a:cxn>
+                                  <a:cxn ang="0">
+                                    <a:pos x="T2" y="T3"/>
+                                  </a:cxn>
+                                  <a:cxn ang="0">
+                                    <a:pos x="T4" y="T5"/>
+                                  </a:cxn>
+                                  <a:cxn ang="0">
+                                    <a:pos x="T6" y="T7"/>
+                                  </a:cxn>
+                                  <a:cxn ang="0">
+                                    <a:pos x="T8" y="T9"/>
+                                  </a:cxn>
+                                  <a:cxn ang="0">
+                                    <a:pos x="T10" y="T11"/>
+                                  </a:cxn>
+                                </a:cxnLst>
+                                <a:rect l="0" t="0" r="r" b="b"/>
+                                <a:pathLst>
+                                  <a:path w="607" h="66">
+                                    <a:moveTo>
+                                      <a:pt x="607" y="0"/>
+                                    </a:moveTo>
+                                    <a:cubicBezTo>
+                                      <a:pt x="450" y="44"/>
+                                      <a:pt x="300" y="57"/>
+                                      <a:pt x="176" y="57"/>
+                                    </a:cubicBezTo>
+                                    <a:cubicBezTo>
+                                      <a:pt x="109" y="57"/>
+                                      <a:pt x="49" y="53"/>
+                                      <a:pt x="0" y="48"/>
+                                    </a:cubicBezTo>
+                                    <a:cubicBezTo>
+                                      <a:pt x="66" y="58"/>
+                                      <a:pt x="152" y="66"/>
+                                      <a:pt x="251" y="66"/>
+                                    </a:cubicBezTo>
+                                    <a:cubicBezTo>
+                                      <a:pt x="358" y="66"/>
+                                      <a:pt x="480" y="56"/>
+                                      <a:pt x="607" y="27"/>
+                                    </a:cubicBezTo>
+                                    <a:cubicBezTo>
+                                      <a:pt x="607" y="0"/>
+                                      <a:pt x="607" y="0"/>
+                                      <a:pt x="607" y="0"/>
+                                    </a:cubicBezTo>
+                                  </a:path>
+                                </a:pathLst>
+                              </a:custGeom>
+                              <a:solidFill>
+                                <a:schemeClr val="bg1">
+                                  <a:alpha val="30000"/>
+                                </a:schemeClr>
+                              </a:solidFill>
+                              <a:ln>
+                                <a:noFill/>
+                              </a:ln>
+                              <a:extLst>
+                                <a:ext uri="{91240B29-F687-4F45-9708-019B960494DF}">
+                                  <a14:hiddenLine xmlns:a14="http://schemas.microsoft.com/office/drawing/2010/main" w="9525">
+                                    <a:solidFill>
+                                      <a:srgbClr val="000000"/>
+                                    </a:solidFill>
+                                    <a:round/>
+                                    <a:headEnd/>
+                                    <a:tailEnd/>
+                                  </a14:hiddenLine>
+                                </a:ext>
+                              </a:extLst>
+                            </wps:spPr>
+                            <wps:bodyPr rot="0" vert="horz" wrap="square" lIns="91440" tIns="45720" rIns="91440" bIns="45720" anchor="b" anchorCtr="0" upright="1">
+                              <a:noAutofit/>
+                            </wps:bodyPr>
+                          </wps:wsp>
+                        </wpg:wgp>
+                      </a:graphicData>
+                    </a:graphic>
+                    <wp14:sizeRelH relativeFrom="margin">
+                      <wp14:pctWidth>115400</wp14:pctWidth>
+                    </wp14:sizeRelH>
+                    <wp14:sizeRelV relativeFrom="page">
+                      <wp14:pctHeight>67000</wp14:pctHeight>
+                    </wp14:sizeRelV>
+                  </wp:anchor>
+                </w:drawing>
+              </mc:Choice>
+              <mc:Fallback>
+                <w:pict>
+                  <v:group w14:anchorId="0DE67124" id="Group 126" o:spid="_x0000_s1026" style="position:absolute;margin-left:0;margin-top:0;width:540pt;height:556.55pt;z-index:-251657216;mso-width-percent:1154;mso-height-percent:670;mso-top-percent:45;mso-position-horizontal:center;mso-position-horizontal-relative:margin;mso-position-vertical-relative:page;mso-width-percent:1154;mso-height-percent:670;mso-top-percent:45;mso-width-relative:margin" coordsize="55613,54044" o:gfxdata="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">
+                    <o:lock v:ext="edit" aspectratio="t"/>
+                    <v:shape id="Freeform 10" o:spid="_x0000_s1027" style="position:absolute;width:55575;height:54044;visibility:visible;mso-wrap-style:square;v-text-anchor:bottom" coordsize="720,700" o:spt="100" o:gfxdata="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" adj="-11796480,,5400" path="m,c,644,,644,,644v23,6,62,14,113,21c250,685,476,700,720,644v,-27,,-27,,-27c720,,720,,720,,,,,,,e" fillcolor="#133759 [2994]" stroked="f">
+                      <v:fill color2="#081828 [2018]" rotate="t" colors="0 #495467;.5 #25374f;1 #051f37" focus="100%" type="gradient">
+                        <o:fill v:ext="view" type="gradientUnscaled"/>
+                      </v:fill>
+                      <v:stroke joinstyle="miter"/>
+                      <v:formulas/>
+                      <v:path arrowok="t" o:connecttype="custom" o:connectlocs="0,0;0,4972126;872222,5134261;5557520,4972126;5557520,4763667;5557520,0;0,0" o:connectangles="0,0,0,0,0,0,0" textboxrect="0,0,720,700"/>
+                      <v:textbox inset="1in,86.4pt,86.4pt,86.4pt">
+                        <w:txbxContent>
+                          <w:p>
+                            <w:pPr>
+                              <w:rPr>
+                                <w:color w:val="FFFFFF" w:themeColor="background1"/>
+                                <w:sz w:val="56"/>
+                                <w:szCs w:val="56"/>
+                              </w:rPr>
+                            </w:pPr>
+                            <w:sdt>
+                              <w:sdtPr>
+                                <w:rPr>
+                                  <w:color w:val="FFFFFF" w:themeColor="background1"/>
+                                  <w:sz w:val="56"/>
+                                  <w:szCs w:val="56"/>
+                                </w:rPr>
+                                <w:alias w:val="Title"/>
+                                <w:tag w:val=""/>
+                                <w:id w:val="-554696155"/>
+                                <w:dataBinding w:prefixMappings="xmlns:ns0='http://purl.org/dc/elements/1.1/' xmlns:ns1='http://schemas.openxmlformats.org/package/2006/metadata/core-properties' " w:xpath="/ns1:coreProperties[1]/ns0:title[1]" w:storeItemID="{6C3C8BC8-F283-45AE-878A-BAB7291924A1}"/>
+                                <w:text/>
+                              </w:sdtPr>
+                              <w:sdtContent>
+                                <w:r>
+                                  <w:rPr>
+                                    <w:color w:val="FFFFFF" w:themeColor="background1"/>
+                                    <w:sz w:val="56"/>
+                                    <w:szCs w:val="56"/>
+                                  </w:rPr>
+                                  <w:t>University Student Portal</w:t>
+                                </w:r>
+                              </w:sdtContent>
+                            </w:sdt>
+                          </w:p>
+                        </w:txbxContent>
+                      </v:textbox>
+                    </v:shape>
+                    <v:shape id="Freeform 11" o:spid="_x0000_s1028" style="position:absolute;left:8763;top:47697;width:46850;height:5099;visibility:visible;mso-wrap-style:square;v-text-anchor:bottom" coordsize="607,66" o:gfxdata="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" path="m607,c450,44,300,57,176,57,109,57,49,53,,48,66,58,152,66,251,66,358,66,480,56,607,27,607,,607,,607,e" fillcolor="white [3212]" stroked="f">
+                      <v:fill opacity="19789f"/>
+                      <v:path arrowok="t" o:connecttype="custom" o:connectlocs="4685030,0;1358427,440373;0,370840;1937302,509905;4685030,208598;4685030,0" o:connectangles="0,0,0,0,0,0"/>
+                    </v:shape>
+                    <w10:wrap anchorx="margin" anchory="page"/>
+                  </v:group>
+                </w:pict>
+              </mc:Fallback>
+            </mc:AlternateContent>
+          </w:r>
+          <w:r>
+            <w:rPr>
+              <w:noProof/>
+            </w:rPr>
+            <mc:AlternateContent>
+              <mc:Choice Requires="wps">
+                <w:drawing>
+                  <wp:anchor distT="0" distB="0" distL="114300" distR="114300" simplePos="0" relativeHeight="251662336" behindDoc="0" locked="0" layoutInCell="1" allowOverlap="1" wp14:anchorId="796CF818" wp14:editId="64769D10">
+                    <wp:simplePos x="0" y="0"/>
+                    <wp:positionH relativeFrom="page">
+                      <wp:align>center</wp:align>
+                    </wp:positionH>
+                    <wp:positionV relativeFrom="margin">
+                      <wp:align>bottom</wp:align>
+                    </wp:positionV>
+                    <wp:extent cx="5753100" cy="146304"/>
+                    <wp:effectExtent l="0" t="0" r="0" b="5715"/>
+                    <wp:wrapSquare wrapText="bothSides"/>
+                    <wp:docPr id="128" name="Text Box 128"/>
+                    <wp:cNvGraphicFramePr/>
+                    <a:graphic xmlns:a="http://schemas.openxmlformats.org/drawingml/2006/main">
+                      <a:graphicData uri="http://schemas.microsoft.com/office/word/2010/wordprocessingShape">
+                        <wps:wsp>
+                          <wps:cNvSpPr txBox="1"/>
+                          <wps:spPr>
+                            <a:xfrm>
+                              <a:off x="0" y="0"/>
+                              <a:ext cx="5753100" cy="146304"/>
+                            </a:xfrm>
+                            <a:prstGeom prst="rect">
+                              <a:avLst/>
+                            </a:prstGeom>
+                            <a:noFill/>
+                            <a:ln w="6350">
+                              <a:noFill/>
+                            </a:ln>
+                            <a:effectLst/>
+                          </wps:spPr>
+                          <wps:style>
+                            <a:lnRef idx="0">
+                              <a:schemeClr val="accent1"/>
+                            </a:lnRef>
+                            <a:fillRef idx="0">
+                              <a:schemeClr val="accent1"/>
+                            </a:fillRef>
+                            <a:effectRef idx="0">
+                              <a:schemeClr val="accent1"/>
+                            </a:effectRef>
+                            <a:fontRef idx="minor">
+                              <a:schemeClr val="dk1"/>
+                            </a:fontRef>
+                          </wps:style>
+                          <wps:txbx>
+                            <w:txbxContent>
+                              <w:p>
+                                <w:pPr>
+                                  <w:pStyle w:val="NoSpacing"/>
+                                  <w:rPr>
+                                    <w:color w:val="7F7F7F" w:themeColor="text1" w:themeTint="80"/>
+                                    <w:sz w:val="18"/>
+                                    <w:szCs w:val="18"/>
+                                  </w:rPr>
+                                </w:pPr>
+                                <w:sdt>
+                                  <w:sdtPr>
+                                    <w:rPr>
+                                      <w:caps/>
+                                      <w:color w:val="7F7F7F" w:themeColor="text1" w:themeTint="80"/>
+                                      <w:sz w:val="18"/>
+                                      <w:szCs w:val="18"/>
+                                    </w:rPr>
+                                    <w:alias w:val="Company"/>
+                                    <w:tag w:val=""/>
+                                    <w:id w:val="-1880927279"/>
+                                    <w:dataBinding w:prefixMappings="xmlns:ns0='http://schemas.openxmlformats.org/officeDocument/2006/extended-properties' " w:xpath="/ns0:Properties[1]/ns0:Company[1]" w:storeItemID="{6668398D-A668-4E3E-A5EB-62B293D839F1}"/>
+                                    <w:text/>
+                                  </w:sdtPr>
+                                  <w:sdtContent>
+                                    <w:r>
+                                      <w:rPr>
+                                        <w:caps/>
+                                        <w:color w:val="7F7F7F" w:themeColor="text1" w:themeTint="80"/>
+                                        <w:sz w:val="18"/>
+                                        <w:szCs w:val="18"/>
+                                      </w:rPr>
+                                      <w:t>john doe university</w:t>
+                                    </w:r>
+                                  </w:sdtContent>
+                                </w:sdt>
+                                <w:r>
+                                  <w:rPr>
+                                    <w:caps/>
+                                    <w:color w:val="7F7F7F" w:themeColor="text1" w:themeTint="80"/>
+                                    <w:sz w:val="18"/>
+                                    <w:szCs w:val="18"/>
+                                  </w:rPr>
+                                  <w:t> </w:t>
+                                </w:r>
+                                <w:r>
+                                  <w:rPr>
+                                    <w:color w:val="7F7F7F" w:themeColor="text1" w:themeTint="80"/>
+                                    <w:sz w:val="18"/>
+                                    <w:szCs w:val="18"/>
+                                  </w:rPr>
+                                  <w:t>| </w:t>
+                                </w:r>
+                                <w:sdt>
+                                  <w:sdtPr>
+                                    <w:rPr>
+                                      <w:color w:val="7F7F7F" w:themeColor="text1" w:themeTint="80"/>
+                                      <w:sz w:val="18"/>
+                                      <w:szCs w:val="18"/>
+                                    </w:rPr>
+                                    <w:alias w:val="Address"/>
+                                    <w:tag w:val=""/>
+                                    <w:id w:val="-1023088507"/>
+                                    <w:dataBinding w:prefixMappings="xmlns:ns0='http://schemas.microsoft.com/office/2006/coverPageProps' " w:xpath="/ns0:CoverPageProperties[1]/ns0:CompanyAddress[1]" w:storeItemID="{55AF091B-3C7A-41E3-B477-F2FDAA23CFDA}"/>
+                                    <w:text/>
+                                  </w:sdtPr>
+                                  <w:sdtContent>
+                                    <w:r>
+                                      <w:rPr>
+                                        <w:color w:val="7F7F7F" w:themeColor="text1" w:themeTint="80"/>
+                                        <w:sz w:val="18"/>
+                                        <w:szCs w:val="18"/>
+                                      </w:rPr>
+                                      <w:t xml:space="preserve">23 Oxford Road, </w:t>
+                                    </w:r>
+                                    <w:proofErr w:type="gramStart"/>
+                                    <w:r>
+                                      <w:rPr>
+                                        <w:color w:val="7F7F7F" w:themeColor="text1" w:themeTint="80"/>
+                                        <w:sz w:val="18"/>
+                                        <w:szCs w:val="18"/>
+                                      </w:rPr>
+                                      <w:t>Overseas</w:t>
+                                    </w:r>
+                                    <w:proofErr w:type="gramEnd"/>
+                                  </w:sdtContent>
+                                </w:sdt>
+                              </w:p>
+                            </w:txbxContent>
+                          </wps:txbx>
+                          <wps:bodyPr rot="0" spcFirstLastPara="0" vertOverflow="overflow" horzOverflow="overflow" vert="horz" wrap="square" lIns="914400" tIns="0" rIns="1097280" bIns="0" numCol="1" spcCol="0" rtlCol="0" fromWordArt="0" anchor="b" anchorCtr="0" forceAA="0" compatLnSpc="1">
+                            <a:prstTxWarp prst="textNoShape">
+                              <a:avLst/>
+                            </a:prstTxWarp>
+                            <a:spAutoFit/>
+                          </wps:bodyPr>
+                        </wps:wsp>
+                      </a:graphicData>
+                    </a:graphic>
+                    <wp14:sizeRelH relativeFrom="margin">
+                      <wp14:pctWidth>115400</wp14:pctWidth>
+                    </wp14:sizeRelH>
+                    <wp14:sizeRelV relativeFrom="margin">
+                      <wp14:pctHeight>0</wp14:pctHeight>
+                    </wp14:sizeRelV>
+                  </wp:anchor>
+                </w:drawing>
+              </mc:Choice>
+              <mc:Fallback>
+                <w:pict>
+                  <v:shapetype w14:anchorId="796CF818" id="_x0000_t202" coordsize="21600,21600" o:spt="202" path="m,l,21600r21600,l21600,xe">
+                    <v:stroke joinstyle="miter"/>
+                    <v:path gradientshapeok="t" o:connecttype="rect"/>
+                  </v:shapetype>
+                  <v:shape id="Text Box 128" o:spid="_x0000_s1029" type="#_x0000_t202" style="position:absolute;margin-left:0;margin-top:0;width:453pt;height:11.5pt;z-index:251662336;visibility:visible;mso-wrap-style:square;mso-width-percent:1154;mso-height-percent:0;mso-wrap-distance-left:9pt;mso-wrap-distance-top:0;mso-wrap-distance-right:9pt;mso-wrap-distance-bottom:0;mso-position-horizontal:center;mso-position-horizontal-relative:page;mso-position-vertical:bottom;mso-position-vertical-relative:margin;mso-width-percent:1154;mso-height-percent:0;mso-width-relative:margin;mso-height-relative:margin;v-text-anchor:bottom" o:gfxdata="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" filled="f" stroked="f" strokeweight=".5pt">
+                    <v:textbox style="mso-fit-shape-to-text:t" inset="1in,0,86.4pt,0">
+                      <w:txbxContent>
+                        <w:p>
+                          <w:pPr>
+                            <w:pStyle w:val="NoSpacing"/>
+                            <w:rPr>
+                              <w:color w:val="7F7F7F" w:themeColor="text1" w:themeTint="80"/>
+                              <w:sz w:val="18"/>
+                              <w:szCs w:val="18"/>
+                            </w:rPr>
+                          </w:pPr>
+                          <w:sdt>
+                            <w:sdtPr>
+                              <w:rPr>
+                                <w:caps/>
+                                <w:color w:val="7F7F7F" w:themeColor="text1" w:themeTint="80"/>
+                                <w:sz w:val="18"/>
+                                <w:szCs w:val="18"/>
+                              </w:rPr>
+                              <w:alias w:val="Company"/>
+                              <w:tag w:val=""/>
+                              <w:id w:val="-1880927279"/>
+                              <w:dataBinding w:prefixMappings="xmlns:ns0='http://schemas.openxmlformats.org/officeDocument/2006/extended-properties' " w:xpath="/ns0:Properties[1]/ns0:Company[1]" w:storeItemID="{6668398D-A668-4E3E-A5EB-62B293D839F1}"/>
+                              <w:text/>
+                            </w:sdtPr>
+                            <w:sdtContent>
+                              <w:r>
+                                <w:rPr>
+                                  <w:caps/>
+                                  <w:color w:val="7F7F7F" w:themeColor="text1" w:themeTint="80"/>
+                                  <w:sz w:val="18"/>
+                                  <w:szCs w:val="18"/>
+                                </w:rPr>
+                                <w:t>john doe university</w:t>
+                              </w:r>
+                            </w:sdtContent>
+                          </w:sdt>
+                          <w:r>
+                            <w:rPr>
+                              <w:caps/>
+                              <w:color w:val="7F7F7F" w:themeColor="text1" w:themeTint="80"/>
+                              <w:sz w:val="18"/>
+                              <w:szCs w:val="18"/>
+                            </w:rPr>
+                            <w:t> </w:t>
+                          </w:r>
+                          <w:r>
+                            <w:rPr>
+                              <w:color w:val="7F7F7F" w:themeColor="text1" w:themeTint="80"/>
+                              <w:sz w:val="18"/>
+                              <w:szCs w:val="18"/>
+                            </w:rPr>
+                            <w:t>| </w:t>
+                          </w:r>
+                          <w:sdt>
+                            <w:sdtPr>
+                              <w:rPr>
+                                <w:color w:val="7F7F7F" w:themeColor="text1" w:themeTint="80"/>
+                                <w:sz w:val="18"/>
+                                <w:szCs w:val="18"/>
+                              </w:rPr>
+                              <w:alias w:val="Address"/>
+                              <w:tag w:val=""/>
+                              <w:id w:val="-1023088507"/>
+                              <w:dataBinding w:prefixMappings="xmlns:ns0='http://schemas.microsoft.com/office/2006/coverPageProps' " w:xpath="/ns0:CoverPageProperties[1]/ns0:CompanyAddress[1]" w:storeItemID="{55AF091B-3C7A-41E3-B477-F2FDAA23CFDA}"/>
+                              <w:text/>
+                            </w:sdtPr>
+                            <w:sdtContent>
+                              <w:r>
+                                <w:rPr>
+                                  <w:color w:val="7F7F7F" w:themeColor="text1" w:themeTint="80"/>
+                                  <w:sz w:val="18"/>
+                                  <w:szCs w:val="18"/>
+                                </w:rPr>
+                                <w:t xml:space="preserve">23 Oxford Road, </w:t>
+                              </w:r>
+                              <w:proofErr w:type="gramStart"/>
+                              <w:r>
+                                <w:rPr>
+                                  <w:color w:val="7F7F7F" w:themeColor="text1" w:themeTint="80"/>
+                                  <w:sz w:val="18"/>
+                                  <w:szCs w:val="18"/>
+                                </w:rPr>
+                                <w:t>Overseas</w:t>
+                              </w:r>
+                              <w:proofErr w:type="gramEnd"/>
+                            </w:sdtContent>
+                          </w:sdt>
+                        </w:p>
+                      </w:txbxContent>
+                    </v:textbox>
+                    <w10:wrap type="square" anchorx="page" anchory="margin"/>
+                  </v:shape>
+                </w:pict>
+              </mc:Fallback>
+            </mc:AlternateContent>
+          </w:r>
+          <w:r>
+            <w:rPr>
+              <w:noProof/>
+            </w:rPr>
+            <mc:AlternateContent>
+              <mc:Choice Requires="wps">
+                <w:drawing>
+                  <wp:anchor distT="0" distB="0" distL="114300" distR="114300" simplePos="0" relativeHeight="251661312" behindDoc="0" locked="0" layoutInCell="1" allowOverlap="1" wp14:anchorId="357461D4" wp14:editId="4CD9D4E3">
+                    <wp:simplePos x="0" y="0"/>
+                    <wp:positionH relativeFrom="page">
+                      <wp:align>center</wp:align>
+                    </wp:positionH>
+                    <mc:AlternateContent>
+                      <mc:Choice Requires="wp14">
+                        <wp:positionV relativeFrom="page">
+                          <wp14:pctPosVOffset>79000</wp14:pctPosVOffset>
+                        </wp:positionV>
+                      </mc:Choice>
+                      <mc:Fallback>
+                        <wp:positionV relativeFrom="page">
+                          <wp:posOffset>8446770</wp:posOffset>
+                        </wp:positionV>
+                      </mc:Fallback>
+                    </mc:AlternateContent>
+                    <wp:extent cx="5753100" cy="484632"/>
+                    <wp:effectExtent l="0" t="0" r="0" b="7620"/>
+                    <wp:wrapSquare wrapText="bothSides"/>
+                    <wp:docPr id="129" name="Text Box 129"/>
+                    <wp:cNvGraphicFramePr/>
+                    <a:graphic xmlns:a="http://schemas.openxmlformats.org/drawingml/2006/main">
+                      <a:graphicData uri="http://schemas.microsoft.com/office/word/2010/wordprocessingShape">
+                        <wps:wsp>
+                          <wps:cNvSpPr txBox="1"/>
+                          <wps:spPr>
+                            <a:xfrm>
+                              <a:off x="0" y="0"/>
+                              <a:ext cx="5753100" cy="484632"/>
+                            </a:xfrm>
+                            <a:prstGeom prst="rect">
+                              <a:avLst/>
+                            </a:prstGeom>
+                            <a:noFill/>
+                            <a:ln w="6350">
+                              <a:noFill/>
+                            </a:ln>
+                            <a:effectLst/>
+                          </wps:spPr>
+                          <wps:style>
+                            <a:lnRef idx="0">
+                              <a:schemeClr val="accent1"/>
+                            </a:lnRef>
+                            <a:fillRef idx="0">
+                              <a:schemeClr val="accent1"/>
+                            </a:fillRef>
+                            <a:effectRef idx="0">
+                              <a:schemeClr val="accent1"/>
+                            </a:effectRef>
+                            <a:fontRef idx="minor">
+                              <a:schemeClr val="dk1"/>
+                            </a:fontRef>
+                          </wps:style>
+                          <wps:txbx>
+                            <w:txbxContent>
+                              <w:sdt>
+                                <w:sdtPr>
+                                  <w:rPr>
+                                    <w:caps/>
+                                    <w:color w:val="156082" w:themeColor="accent1"/>
+                                    <w:sz w:val="28"/>
+                                    <w:szCs w:val="28"/>
+                                  </w:rPr>
+                                  <w:alias w:val="Subtitle"/>
+                                  <w:tag w:val=""/>
+                                  <w:id w:val="-1452929454"/>
+                                  <w:dataBinding w:prefixMappings="xmlns:ns0='http://purl.org/dc/elements/1.1/' xmlns:ns1='http://schemas.openxmlformats.org/package/2006/metadata/core-properties' " w:xpath="/ns1:coreProperties[1]/ns0:subject[1]" w:storeItemID="{6C3C8BC8-F283-45AE-878A-BAB7291924A1}"/>
+                                  <w:text/>
+                                </w:sdtPr>
+                                <w:sdtContent>
+                                  <w:p>
+                                    <w:pPr>
+                                      <w:pStyle w:val="NoSpacing"/>
+                                      <w:spacing w:before="40" w:after="40"/>
+                                      <w:rPr>
+                                        <w:caps/>
+                                        <w:color w:val="156082" w:themeColor="accent1"/>
+                                        <w:sz w:val="28"/>
+                                        <w:szCs w:val="28"/>
+                                      </w:rPr>
+                                    </w:pPr>
+                                    <w:r>
+                                      <w:rPr>
+                                        <w:caps/>
+                                        <w:color w:val="156082" w:themeColor="accent1"/>
+                                        <w:sz w:val="28"/>
+                                        <w:szCs w:val="28"/>
+                                      </w:rPr>
+                                      <w:t xml:space="preserve">Test Strategy </w:t>
+                                    </w:r>
+                                  </w:p>
+                                </w:sdtContent>
+                              </w:sdt>
+                              <w:sdt>
+                                <w:sdtPr>
+                                  <w:rPr>
+                                    <w:caps/>
+                                    <w:color w:val="000000" w:themeColor="text1"/>
+                                    <w:sz w:val="24"/>
+                                    <w:szCs w:val="24"/>
+                                  </w:rPr>
+                                  <w:alias w:val="Author"/>
+                                  <w:tag w:val=""/>
+                                  <w:id w:val="-954487662"/>
+                                  <w:dataBinding w:prefixMappings="xmlns:ns0='http://purl.org/dc/elements/1.1/' xmlns:ns1='http://schemas.openxmlformats.org/package/2006/metadata/core-properties' " w:xpath="/ns1:coreProperties[1]/ns0:creator[1]" w:storeItemID="{6C3C8BC8-F283-45AE-878A-BAB7291924A1}"/>
+                                  <w:text/>
+                                </w:sdtPr>
+                                <w:sdtContent>
+                                  <w:p>
+                                    <w:pPr>
+                                      <w:pStyle w:val="NoSpacing"/>
+                                      <w:spacing w:before="40" w:after="40"/>
+                                      <w:rPr>
+                                        <w:caps/>
+                                        <w:color w:val="000000" w:themeColor="text1"/>
+                                        <w:sz w:val="24"/>
+                                        <w:szCs w:val="24"/>
+                                      </w:rPr>
+                                    </w:pPr>
+                                    <w:r>
+                                      <w:rPr>
+                                        <w:caps/>
+                                        <w:color w:val="000000" w:themeColor="text1"/>
+                                        <w:sz w:val="24"/>
+                                        <w:szCs w:val="24"/>
+                                      </w:rPr>
+                                      <w:t>Author: Natasha Mabaire</w:t>
+                                    </w:r>
+                                  </w:p>
+                                </w:sdtContent>
+                              </w:sdt>
+                            </w:txbxContent>
+                          </wps:txbx>
+                          <wps:bodyPr rot="0" spcFirstLastPara="0" vertOverflow="overflow" horzOverflow="overflow" vert="horz" wrap="square" lIns="914400" tIns="0" rIns="1097280" bIns="0" numCol="1" spcCol="0" rtlCol="0" fromWordArt="0" anchor="t" anchorCtr="0" forceAA="0" compatLnSpc="1">
+                            <a:prstTxWarp prst="textNoShape">
+                              <a:avLst/>
+                            </a:prstTxWarp>
+                            <a:spAutoFit/>
+                          </wps:bodyPr>
+                        </wps:wsp>
+                      </a:graphicData>
+                    </a:graphic>
+                    <wp14:sizeRelH relativeFrom="margin">
+                      <wp14:pctWidth>115400</wp14:pctWidth>
+                    </wp14:sizeRelH>
+                    <wp14:sizeRelV relativeFrom="margin">
+                      <wp14:pctHeight>0</wp14:pctHeight>
+                    </wp14:sizeRelV>
+                  </wp:anchor>
+                </w:drawing>
+              </mc:Choice>
+              <mc:Fallback>
+                <w:pict>
+                  <v:shape w14:anchorId="357461D4" id="Text Box 129" o:spid="_x0000_s1030" type="#_x0000_t202" style="position:absolute;margin-left:0;margin-top:0;width:453pt;height:38.15pt;z-index:251661312;visibility:visible;mso-wrap-style:square;mso-width-percent:1154;mso-height-percent:0;mso-top-percent:790;mso-wrap-distance-left:9pt;mso-wrap-distance-top:0;mso-wrap-distance-right:9pt;mso-wrap-distance-bottom:0;mso-position-horizontal:center;mso-position-horizontal-relative:page;mso-position-vertical-relative:page;mso-width-percent:1154;mso-height-percent:0;mso-top-percent:790;mso-width-relative:margin;mso-height-relative:margin;v-text-anchor:top" o:gfxdata="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" filled="f" stroked="f" strokeweight=".5pt">
+                    <v:textbox style="mso-fit-shape-to-text:t" inset="1in,0,86.4pt,0">
+                      <w:txbxContent>
+                        <w:sdt>
+                          <w:sdtPr>
+                            <w:rPr>
+                              <w:caps/>
+                              <w:color w:val="156082" w:themeColor="accent1"/>
+                              <w:sz w:val="28"/>
+                              <w:szCs w:val="28"/>
+                            </w:rPr>
+                            <w:alias w:val="Subtitle"/>
+                            <w:tag w:val=""/>
+                            <w:id w:val="-1452929454"/>
+                            <w:dataBinding w:prefixMappings="xmlns:ns0='http://purl.org/dc/elements/1.1/' xmlns:ns1='http://schemas.openxmlformats.org/package/2006/metadata/core-properties' " w:xpath="/ns1:coreProperties[1]/ns0:subject[1]" w:storeItemID="{6C3C8BC8-F283-45AE-878A-BAB7291924A1}"/>
+                            <w:text/>
+                          </w:sdtPr>
+                          <w:sdtContent>
+                            <w:p>
+                              <w:pPr>
+                                <w:pStyle w:val="NoSpacing"/>
+                                <w:spacing w:before="40" w:after="40"/>
+                                <w:rPr>
+                                  <w:caps/>
+                                  <w:color w:val="156082" w:themeColor="accent1"/>
+                                  <w:sz w:val="28"/>
+                                  <w:szCs w:val="28"/>
+                                </w:rPr>
+                              </w:pPr>
+                              <w:r>
+                                <w:rPr>
+                                  <w:caps/>
+                                  <w:color w:val="156082" w:themeColor="accent1"/>
+                                  <w:sz w:val="28"/>
+                                  <w:szCs w:val="28"/>
+                                </w:rPr>
+                                <w:t xml:space="preserve">Test Strategy </w:t>
+                              </w:r>
+                            </w:p>
+                          </w:sdtContent>
+                        </w:sdt>
+                        <w:sdt>
+                          <w:sdtPr>
+                            <w:rPr>
+                              <w:caps/>
+                              <w:color w:val="000000" w:themeColor="text1"/>
+                              <w:sz w:val="24"/>
+                              <w:szCs w:val="24"/>
+                            </w:rPr>
+                            <w:alias w:val="Author"/>
+                            <w:tag w:val=""/>
+                            <w:id w:val="-954487662"/>
+                            <w:dataBinding w:prefixMappings="xmlns:ns0='http://purl.org/dc/elements/1.1/' xmlns:ns1='http://schemas.openxmlformats.org/package/2006/metadata/core-properties' " w:xpath="/ns1:coreProperties[1]/ns0:creator[1]" w:storeItemID="{6C3C8BC8-F283-45AE-878A-BAB7291924A1}"/>
+                            <w:text/>
+                          </w:sdtPr>
+                          <w:sdtContent>
+                            <w:p>
+                              <w:pPr>
+                                <w:pStyle w:val="NoSpacing"/>
+                                <w:spacing w:before="40" w:after="40"/>
+                                <w:rPr>
+                                  <w:caps/>
+                                  <w:color w:val="000000" w:themeColor="text1"/>
+                                  <w:sz w:val="24"/>
+                                  <w:szCs w:val="24"/>
+                                </w:rPr>
+                              </w:pPr>
+                              <w:r>
+                                <w:rPr>
+                                  <w:caps/>
+                                  <w:color w:val="000000" w:themeColor="text1"/>
+                                  <w:sz w:val="24"/>
+                                  <w:szCs w:val="24"/>
+                                </w:rPr>
+                                <w:t>Author: Natasha Mabaire</w:t>
+                              </w:r>
+                            </w:p>
+                          </w:sdtContent>
+                        </w:sdt>
+                      </w:txbxContent>
+                    </v:textbox>
+                    <w10:wrap type="square" anchorx="page" anchory="page"/>
+                  </v:shape>
+                </w:pict>
+              </mc:Fallback>
+            </mc:AlternateContent>
+          </w:r>
+          <w:r>
+            <w:rPr>
+              <w:noProof/>
+            </w:rPr>
+            <mc:AlternateContent>
+              <mc:Choice Requires="wps">
+                <w:drawing>
+                  <wp:anchor distT="0" distB="0" distL="114300" distR="114300" simplePos="0" relativeHeight="251660288" behindDoc="0" locked="0" layoutInCell="1" allowOverlap="1" wp14:anchorId="5BC8DE42" wp14:editId="440362FE">
+                    <wp:simplePos x="0" y="0"/>
+                    <wp:positionH relativeFrom="margin">
+                      <wp:align>right</wp:align>
+                    </wp:positionH>
+                    <mc:AlternateContent>
+                      <mc:Choice Requires="wp14">
+                        <wp:positionV relativeFrom="page">
+                          <wp14:pctPosVOffset>2300</wp14:pctPosVOffset>
+                        </wp:positionV>
+                      </mc:Choice>
+                      <mc:Fallback>
+                        <wp:positionV relativeFrom="page">
+                          <wp:posOffset>245745</wp:posOffset>
+                        </wp:positionV>
+                      </mc:Fallback>
+                    </mc:AlternateContent>
+                    <wp:extent cx="594360" cy="987552"/>
+                    <wp:effectExtent l="0" t="0" r="0" b="5080"/>
+                    <wp:wrapNone/>
+                    <wp:docPr id="130" name="Rectangle 130"/>
+                    <wp:cNvGraphicFramePr>
+                      <a:graphicFrameLocks xmlns:a="http://schemas.openxmlformats.org/drawingml/2006/main" noChangeAspect="1"/>
+                    </wp:cNvGraphicFramePr>
+                    <a:graphic xmlns:a="http://schemas.openxmlformats.org/drawingml/2006/main">
+                      <a:graphicData uri="http://schemas.microsoft.com/office/word/2010/wordprocessingShape">
+                        <wps:wsp>
+                          <wps:cNvSpPr>
+                            <a:spLocks noChangeAspect="1"/>
+                          </wps:cNvSpPr>
+                          <wps:spPr>
+                            <a:xfrm>
+                              <a:off x="0" y="0"/>
+                              <a:ext cx="594360" cy="987552"/>
+                            </a:xfrm>
+                            <a:prstGeom prst="rect">
+                              <a:avLst/>
+                            </a:prstGeom>
+                            <a:ln>
+                              <a:noFill/>
+                            </a:ln>
+                          </wps:spPr>
+                          <wps:style>
+                            <a:lnRef idx="2">
+                              <a:schemeClr val="accent1">
+                                <a:shade val="50000"/>
+                              </a:schemeClr>
+                            </a:lnRef>
+                            <a:fillRef idx="1">
+                              <a:schemeClr val="accent1"/>
+                            </a:fillRef>
+                            <a:effectRef idx="0">
+                              <a:schemeClr val="accent1"/>
+                            </a:effectRef>
+                            <a:fontRef idx="minor">
+                              <a:schemeClr val="lt1"/>
+                            </a:fontRef>
+                          </wps:style>
+                          <wps:txbx>
+                            <w:txbxContent>
+                              <w:sdt>
+                                <w:sdtPr>
+                                  <w:rPr>
+                                    <w:color w:val="FFFFFF" w:themeColor="background1"/>
+                                    <w:sz w:val="24"/>
+                                    <w:szCs w:val="24"/>
+                                  </w:rPr>
+                                  <w:alias w:val="Year"/>
+                                  <w:tag w:val=""/>
+                                  <w:id w:val="1595126926"/>
+                                  <w:dataBinding w:prefixMappings="xmlns:ns0='http://schemas.microsoft.com/office/2006/coverPageProps' " w:xpath="/ns0:CoverPageProperties[1]/ns0:PublishDate[1]" w:storeItemID="{55AF091B-3C7A-41E3-B477-F2FDAA23CFDA}"/>
+                                  <w:date>
+                                    <w:dateFormat w:val="yyyy"/>
+                                    <w:lid w:val="en-US"/>
+                                    <w:storeMappedDataAs w:val="dateTime"/>
+                                    <w:calendar w:val="gregorian"/>
+                                  </w:date>
+                                </w:sdtPr>
+                                <w:sdtContent>
+                                  <w:p>
+                                    <w:pPr>
+                                      <w:pStyle w:val="NoSpacing"/>
+                                      <w:jc w:val="right"/>
+                                      <w:rPr>
+                                        <w:color w:val="FFFFFF" w:themeColor="background1"/>
+                                        <w:sz w:val="24"/>
+                                        <w:szCs w:val="24"/>
+                                      </w:rPr>
+                                    </w:pPr>
+                                    <w:r>
+                                      <w:rPr>
+                                        <w:color w:val="FFFFFF" w:themeColor="background1"/>
+                                        <w:sz w:val="24"/>
+                                        <w:szCs w:val="24"/>
+                                      </w:rPr>
+                                      <w:t>MTP</w:t>
+                                    </w:r>
+                                  </w:p>
+                                </w:sdtContent>
+                              </w:sdt>
+                            </w:txbxContent>
+                          </wps:txbx>
+                          <wps:bodyPr rot="0" spcFirstLastPara="0" vertOverflow="overflow" horzOverflow="overflow" vert="horz" wrap="square" lIns="45720" tIns="45720" rIns="45720" bIns="45720" numCol="1" spcCol="0" rtlCol="0" fromWordArt="0" anchor="b" anchorCtr="0" forceAA="0" compatLnSpc="1">
+                            <a:prstTxWarp prst="textNoShape">
+                              <a:avLst/>
+                            </a:prstTxWarp>
+                            <a:noAutofit/>
+                          </wps:bodyPr>
+                        </wps:wsp>
+                      </a:graphicData>
+                    </a:graphic>
+                    <wp14:sizeRelH relativeFrom="page">
+                      <wp14:pctWidth>7600</wp14:pctWidth>
+                    </wp14:sizeRelH>
+                    <wp14:sizeRelV relativeFrom="page">
+                      <wp14:pctHeight>9800</wp14:pctHeight>
+                    </wp14:sizeRelV>
+                  </wp:anchor>
+                </w:drawing>
+              </mc:Choice>
+              <mc:Fallback>
+                <w:pict>
+                  <v:rect w14:anchorId="5BC8DE42" id="Rectangle 130" o:spid="_x0000_s1031" style="position:absolute;margin-left:-4.4pt;margin-top:0;width:46.8pt;height:77.75pt;z-index:251660288;visibility:visible;mso-wrap-style:square;mso-width-percent:76;mso-height-percent:98;mso-top-percent:23;mso-wrap-distance-left:9pt;mso-wrap-distance-top:0;mso-wrap-distance-right:9pt;mso-wrap-distance-bottom:0;mso-position-horizontal:right;mso-position-horizontal-relative:margin;mso-position-vertical-relative:page;mso-width-percent:76;mso-height-percent:98;mso-top-percent:23;mso-width-relative:page;mso-height-relative:page;v-text-anchor:bottom" o:gfxdata="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" fillcolor="#156082 [3204]" stroked="f" strokeweight="1.5pt">
+                    <o:lock v:ext="edit" aspectratio="t"/>
+                    <v:textbox inset="3.6pt,,3.6pt">
+                      <w:txbxContent>
+                        <w:sdt>
+                          <w:sdtPr>
+                            <w:rPr>
+                              <w:color w:val="FFFFFF" w:themeColor="background1"/>
+                              <w:sz w:val="24"/>
+                              <w:szCs w:val="24"/>
+                            </w:rPr>
+                            <w:alias w:val="Year"/>
+                            <w:tag w:val=""/>
+                            <w:id w:val="1595126926"/>
+                            <w:dataBinding w:prefixMappings="xmlns:ns0='http://schemas.microsoft.com/office/2006/coverPageProps' " w:xpath="/ns0:CoverPageProperties[1]/ns0:PublishDate[1]" w:storeItemID="{55AF091B-3C7A-41E3-B477-F2FDAA23CFDA}"/>
+                            <w:date>
+                              <w:dateFormat w:val="yyyy"/>
+                              <w:lid w:val="en-US"/>
+                              <w:storeMappedDataAs w:val="dateTime"/>
+                              <w:calendar w:val="gregorian"/>
+                            </w:date>
+                          </w:sdtPr>
+                          <w:sdtContent>
+                            <w:p>
+                              <w:pPr>
+                                <w:pStyle w:val="NoSpacing"/>
+                                <w:jc w:val="right"/>
+                                <w:rPr>
+                                  <w:color w:val="FFFFFF" w:themeColor="background1"/>
+                                  <w:sz w:val="24"/>
+                                  <w:szCs w:val="24"/>
+                                </w:rPr>
+                              </w:pPr>
+                              <w:r>
+                                <w:rPr>
+                                  <w:color w:val="FFFFFF" w:themeColor="background1"/>
+                                  <w:sz w:val="24"/>
+                                  <w:szCs w:val="24"/>
+                                </w:rPr>
+                                <w:t>MTP</w:t>
+                              </w:r>
+                            </w:p>
+                          </w:sdtContent>
+                        </w:sdt>
+                      </w:txbxContent>
+                    </v:textbox>
+                    <w10:wrap anchorx="margin" anchory="page"/>
+                  </v:rect>
+                </w:pict>
+              </mc:Fallback>
+            </mc:AlternateContent>
+          </w:r>
+          <w:r>
+            <w:rPr>
+              <w:u w:val="single"/>
+            </w:rPr>
+            <w:br w:type="page"/>
+          </w:r>
+        </w:p>
+      </w:sdtContent>
+    </w:sdt>
+    <w:p>
+      <w:r>
+        <w:lastRenderedPageBreak/>
+        <w:t xml:space="preserve">The University Student Portal is a web-based portal that allows students to </w:t>
+      </w:r>
+      <w:r>
+        <w:t>perform</w:t>
+      </w:r>
+      <w:r>
+        <w:t xml:space="preserve"> a variety of tasks that are associated with enrolment</w:t>
+      </w:r>
+      <w:r>
+        <w:t>,</w:t>
+      </w:r>
+      <w:r>
+        <w:t xml:space="preserve"> as well as </w:t>
+      </w:r>
+      <w:r>
+        <w:t>observe</w:t>
+      </w:r>
+      <w:r>
+        <w:t xml:space="preserve"> the progress they have made in the courses they are enrolled in.</w:t>
+      </w:r>
+    </w:p>
+    <w:p>
+      <w:r>
+        <w:t>System Overview</w:t>
+      </w:r>
+      <w:r>
+        <w:t xml:space="preserve"> (</w:t>
+      </w:r>
+      <w:r>
+        <w:rPr>
+          <w:i/>
+          <w:iCs/>
+        </w:rPr>
+        <w:t>the system consists of the following</w:t>
+      </w:r>
+      <w:r>
+        <w:rPr>
+          <w:i/>
+          <w:iCs/>
+        </w:rPr>
+        <w:t xml:space="preserve"> units</w:t>
+      </w:r>
+      <w:r>
+        <w:rPr>
+          <w:i/>
+          <w:iCs/>
+        </w:rPr>
+        <w:t xml:space="preserve">, which are presented in the form of web </w:t>
+      </w:r>
+      <w:r>
+        <w:rPr>
+          <w:i/>
+          <w:iCs/>
+        </w:rPr>
+        <w:t>pages</w:t>
+      </w:r>
+      <w:r>
+        <w:t>)</w:t>
+      </w:r>
+      <w:r>
+        <w:t>:</w:t>
       </w:r>
     </w:p>
     <w:p>
@@ -89,6 +1228,11 @@
       </w:r>
     </w:p>
     <w:p>
+      <w:r>
+        <w:t>Component testing:</w:t>
+      </w:r>
+    </w:p>
+    <w:p>
       <w:pPr>
         <w:pStyle w:val="ListParagraph"/>
         <w:numPr>
@@ -97,7 +1241,7 @@
         </w:numPr>
       </w:pPr>
       <w:r>
-        <w:t>Testing the overall functionality of each individual unit of the system:</w:t>
+        <w:t>Testing the functionality of each unit of the system:</w:t>
       </w:r>
     </w:p>
     <w:p>
@@ -111,6 +1255,9 @@
       <w:r>
         <w:t xml:space="preserve">Registration </w:t>
       </w:r>
+      <w:r>
+        <w:t>page</w:t>
+      </w:r>
     </w:p>
     <w:p>
       <w:pPr>
@@ -123,6 +1270,9 @@
       <w:r>
         <w:t>Login</w:t>
       </w:r>
+      <w:r>
+        <w:t xml:space="preserve"> page</w:t>
+      </w:r>
     </w:p>
     <w:p>
       <w:pPr>
@@ -135,6 +1285,9 @@
       <w:r>
         <w:t>Course Enrolling</w:t>
       </w:r>
+      <w:r>
+        <w:t xml:space="preserve"> page</w:t>
+      </w:r>
     </w:p>
     <w:p>
       <w:pPr>
@@ -147,6 +1300,9 @@
       <w:r>
         <w:t>Grade Viewing</w:t>
       </w:r>
+      <w:r>
+        <w:t xml:space="preserve"> page</w:t>
+      </w:r>
     </w:p>
     <w:p>
       <w:pPr>
@@ -159,6 +1315,72 @@
       <w:r>
         <w:t>Profile Updates</w:t>
       </w:r>
+      <w:r>
+        <w:t xml:space="preserve"> page</w:t>
+      </w:r>
+    </w:p>
+    <w:p>
+      <w:r>
+        <w:t>System testing:</w:t>
+      </w:r>
+    </w:p>
+    <w:p>
+      <w:pPr>
+        <w:pStyle w:val="ListParagraph"/>
+        <w:numPr>
+          <w:ilvl w:val="1"/>
+          <w:numId w:val="21"/>
+        </w:numPr>
+      </w:pPr>
+      <w:r>
+        <w:t>End–to–end testing: registration -&gt; login -&gt; course enrolment -&gt; grade viewing -&gt; profile update</w:t>
+      </w:r>
+    </w:p>
+    <w:p>
+      <w:pPr>
+        <w:pStyle w:val="ListParagraph"/>
+        <w:numPr>
+          <w:ilvl w:val="1"/>
+          <w:numId w:val="21"/>
+        </w:numPr>
+      </w:pPr>
+      <w:r>
+        <w:t>Verifying UI</w:t>
+      </w:r>
+    </w:p>
+    <w:p>
+      <w:pPr>
+        <w:pStyle w:val="ListParagraph"/>
+        <w:numPr>
+          <w:ilvl w:val="1"/>
+          <w:numId w:val="21"/>
+        </w:numPr>
+      </w:pPr>
+      <w:r>
+        <w:t>Verifying and validating readability and system flow</w:t>
+      </w:r>
+    </w:p>
+    <w:p>
+      <w:r>
+        <w:t>Acceptance testing:</w:t>
+      </w:r>
+    </w:p>
+    <w:p>
+      <w:pPr>
+        <w:pStyle w:val="ListParagraph"/>
+        <w:numPr>
+          <w:ilvl w:val="1"/>
+          <w:numId w:val="22"/>
+        </w:numPr>
+      </w:pPr>
+      <w:r>
+        <w:t>Business requirement confirmation</w:t>
+      </w:r>
+    </w:p>
+    <w:p>
+      <w:r>
+        <w:t>Out of Scope</w:t>
+      </w:r>
     </w:p>
     <w:p>
       <w:pPr>
@@ -169,47 +1391,6 @@
         </w:numPr>
       </w:pPr>
       <w:r>
-        <w:t>Testing the entire system, from one end (registration) to the other ( profile updates)</w:t>
-      </w:r>
-    </w:p>
-    <w:p>
-      <w:pPr>
-        <w:pStyle w:val="ListParagraph"/>
-        <w:numPr>
-          <w:ilvl w:val="0"/>
-          <w:numId w:val="17"/>
-        </w:numPr>
-      </w:pPr>
-      <w:r>
-        <w:t>Verifying UI</w:t>
-      </w:r>
-    </w:p>
-    <w:p>
-      <w:pPr>
-        <w:pStyle w:val="ListParagraph"/>
-        <w:numPr>
-          <w:ilvl w:val="0"/>
-          <w:numId w:val="17"/>
-        </w:numPr>
-      </w:pPr>
-      <w:r>
-        <w:t>Verifying and validating readability and system flow</w:t>
-      </w:r>
-    </w:p>
-    <w:p>
-      <w:r>
-        <w:t>Out of Scope</w:t>
-      </w:r>
-    </w:p>
-    <w:p>
-      <w:pPr>
-        <w:pStyle w:val="ListParagraph"/>
-        <w:numPr>
-          <w:ilvl w:val="0"/>
-          <w:numId w:val="17"/>
-        </w:numPr>
-      </w:pPr>
-      <w:r>
         <w:t>The following features are out of the scope of testing:</w:t>
       </w:r>
     </w:p>
@@ -246,9 +1427,440 @@
     <w:p>
       <w:pPr>
         <w:pStyle w:val="ListParagraph"/>
+        <w:ind w:left="1440"/>
+      </w:pPr>
+    </w:p>
+    <w:p>
+      <w:pPr>
+        <w:pStyle w:val="ListParagraph"/>
+        <w:ind w:left="1440"/>
+      </w:pPr>
+    </w:p>
+    <w:p>
+      <w:pPr>
+        <w:pStyle w:val="Heading1"/>
+      </w:pPr>
+      <w:r>
+        <w:t>Requirements</w:t>
+      </w:r>
+    </w:p>
+    <w:p>
+      <w:pPr>
+        <w:pStyle w:val="Heading2"/>
+      </w:pPr>
+      <w:r>
+        <w:rPr>
+          <w:highlight w:val="cyan"/>
+        </w:rPr>
+        <w:t>Functional Requirements</w:t>
+      </w:r>
+    </w:p>
+    <w:p>
+      <w:pPr>
+        <w:pStyle w:val="ListParagraph"/>
+        <w:rPr>
+          <w:u w:val="single"/>
+        </w:rPr>
+      </w:pPr>
+      <w:r>
+        <w:rPr>
+          <w:u w:val="single"/>
+        </w:rPr>
+        <w:t>FR1 - User Registration</w:t>
+      </w:r>
+    </w:p>
+    <w:p>
+      <w:pPr>
+        <w:pStyle w:val="ListParagraph"/>
         <w:numPr>
           <w:ilvl w:val="0"/>
-          <w:numId w:val="1"/>
+          <w:numId w:val="3"/>
+        </w:numPr>
+      </w:pPr>
+      <w:r>
+        <w:t>Students must register with:</w:t>
+      </w:r>
+    </w:p>
+    <w:p>
+      <w:pPr>
+        <w:pStyle w:val="ListParagraph"/>
+        <w:numPr>
+          <w:ilvl w:val="1"/>
+          <w:numId w:val="4"/>
+        </w:numPr>
+      </w:pPr>
+      <w:r>
+        <w:t>Email (valid format)</w:t>
+      </w:r>
+    </w:p>
+    <w:p>
+      <w:pPr>
+        <w:pStyle w:val="ListParagraph"/>
+        <w:numPr>
+          <w:ilvl w:val="1"/>
+          <w:numId w:val="4"/>
+        </w:numPr>
+      </w:pPr>
+      <w:r>
+        <w:t>Password (8</w:t>
+      </w:r>
+      <w:r>
+        <w:t>-</w:t>
+      </w:r>
+      <w:r>
+        <w:t>16 chars)</w:t>
+      </w:r>
+    </w:p>
+    <w:p>
+      <w:pPr>
+        <w:pStyle w:val="ListParagraph"/>
+        <w:numPr>
+          <w:ilvl w:val="1"/>
+          <w:numId w:val="4"/>
+        </w:numPr>
+      </w:pPr>
+      <w:r>
+        <w:t>Student ID (numeric)</w:t>
+      </w:r>
+    </w:p>
+    <w:p>
+      <w:pPr>
+        <w:pStyle w:val="ListParagraph"/>
+        <w:numPr>
+          <w:ilvl w:val="0"/>
+          <w:numId w:val="4"/>
+        </w:numPr>
+      </w:pPr>
+      <w:r>
+        <w:t>A register button must be present to capture information provided by the student</w:t>
+      </w:r>
+    </w:p>
+    <w:p>
+      <w:pPr>
+        <w:pStyle w:val="ListParagraph"/>
+        <w:numPr>
+          <w:ilvl w:val="0"/>
+          <w:numId w:val="4"/>
+        </w:numPr>
+      </w:pPr>
+      <w:r>
+        <w:t>A login button must be present to redirect students who have already registered to the login page</w:t>
+      </w:r>
+    </w:p>
+    <w:p>
+      <w:pPr>
+        <w:pStyle w:val="ListParagraph"/>
+        <w:numPr>
+          <w:ilvl w:val="0"/>
+          <w:numId w:val="4"/>
+        </w:numPr>
+      </w:pPr>
+      <w:r>
+        <w:rPr>
+          <w:i/>
+          <w:iCs/>
+        </w:rPr>
+        <w:t>Test</w:t>
+      </w:r>
+      <w:r>
+        <w:rPr>
+          <w:i/>
+          <w:iCs/>
+        </w:rPr>
+        <w:t>a</w:t>
+      </w:r>
+      <w:r>
+        <w:rPr>
+          <w:i/>
+          <w:iCs/>
+        </w:rPr>
+        <w:t>bility</w:t>
+      </w:r>
+      <w:r>
+        <w:t xml:space="preserve">: </w:t>
+      </w:r>
+      <w:r>
+        <w:t>Verify that the registration form accepts valid email, password, and student ID inputs and successfully creates a user account, resulting in redirection to the portal home page. Verify that invalid or missing inputs trigger clear validation error messages indicating the specific incorrect field. Verify that existing registered users attempting to register are prompted to log in instead.</w:t>
+      </w:r>
+    </w:p>
+    <w:p>
+      <w:pPr>
+        <w:pStyle w:val="ListParagraph"/>
+      </w:pPr>
+    </w:p>
+    <w:p>
+      <w:pPr>
+        <w:pStyle w:val="ListParagraph"/>
+        <w:rPr>
+          <w:u w:val="single"/>
+        </w:rPr>
+      </w:pPr>
+      <w:r>
+        <w:rPr>
+          <w:u w:val="single"/>
+        </w:rPr>
+        <w:t xml:space="preserve">FR2 </w:t>
+      </w:r>
+      <w:r>
+        <w:rPr>
+          <w:u w:val="single"/>
+        </w:rPr>
+        <w:t xml:space="preserve">- </w:t>
+      </w:r>
+      <w:r>
+        <w:rPr>
+          <w:u w:val="single"/>
+        </w:rPr>
+        <w:t>Login System</w:t>
+      </w:r>
+    </w:p>
+    <w:p>
+      <w:pPr>
+        <w:pStyle w:val="ListParagraph"/>
+        <w:numPr>
+          <w:ilvl w:val="0"/>
+          <w:numId w:val="5"/>
+        </w:numPr>
+      </w:pPr>
+      <w:r>
+        <w:t>Valid credentials required</w:t>
+      </w:r>
+    </w:p>
+    <w:p>
+      <w:pPr>
+        <w:pStyle w:val="ListParagraph"/>
+        <w:numPr>
+          <w:ilvl w:val="0"/>
+          <w:numId w:val="5"/>
+        </w:numPr>
+      </w:pPr>
+      <w:r>
+        <w:t>Account locks after 5 failed attempts</w:t>
+      </w:r>
+    </w:p>
+    <w:p>
+      <w:pPr>
+        <w:pStyle w:val="ListParagraph"/>
+        <w:numPr>
+          <w:ilvl w:val="0"/>
+          <w:numId w:val="5"/>
+        </w:numPr>
+      </w:pPr>
+      <w:r>
+        <w:t>A login button must be present to capture credentials supplied by the student and redirect the student to the home page of the portal</w:t>
+      </w:r>
+    </w:p>
+    <w:p>
+      <w:pPr>
+        <w:pStyle w:val="ListParagraph"/>
+        <w:numPr>
+          <w:ilvl w:val="0"/>
+          <w:numId w:val="5"/>
+        </w:numPr>
+      </w:pPr>
+      <w:r>
+        <w:t>A register button must be present to redirect students to the registration page if they have not yet registered for an account</w:t>
+      </w:r>
+    </w:p>
+    <w:p>
+      <w:pPr>
+        <w:pStyle w:val="ListParagraph"/>
+        <w:numPr>
+          <w:ilvl w:val="0"/>
+          <w:numId w:val="5"/>
+        </w:numPr>
+      </w:pPr>
+      <w:r>
+        <w:rPr>
+          <w:i/>
+          <w:iCs/>
+        </w:rPr>
+        <w:t>Testability</w:t>
+      </w:r>
+      <w:r>
+        <w:t xml:space="preserve">: </w:t>
+      </w:r>
+      <w:r>
+        <w:t>Verify that the login form validates the correct student login credentials and redirects to the portal home page.</w:t>
+      </w:r>
+      <w:r>
+        <w:t xml:space="preserve"> </w:t>
+      </w:r>
+      <w:r>
+        <w:t xml:space="preserve">Verify that incorrect credentials trigger clear validation </w:t>
+      </w:r>
+      <w:r>
+        <w:t>error messages indicating incorrect credentials and prompt the user to provide correct credentials, clearing the incorrect credentials that had been provided initially.</w:t>
+      </w:r>
+    </w:p>
+    <w:p>
+      <w:pPr>
+        <w:pStyle w:val="ListParagraph"/>
+      </w:pPr>
+    </w:p>
+    <w:p>
+      <w:pPr>
+        <w:pStyle w:val="ListParagraph"/>
+        <w:rPr>
+          <w:u w:val="single"/>
+        </w:rPr>
+      </w:pPr>
+      <w:r>
+        <w:rPr>
+          <w:u w:val="single"/>
+        </w:rPr>
+        <w:t xml:space="preserve">FR3 </w:t>
+      </w:r>
+      <w:r>
+        <w:rPr>
+          <w:u w:val="single"/>
+        </w:rPr>
+        <w:t xml:space="preserve">- </w:t>
+      </w:r>
+      <w:r>
+        <w:rPr>
+          <w:u w:val="single"/>
+        </w:rPr>
+        <w:t>Course Enrolment</w:t>
+      </w:r>
+    </w:p>
+    <w:p>
+      <w:pPr>
+        <w:pStyle w:val="ListParagraph"/>
+        <w:numPr>
+          <w:ilvl w:val="0"/>
+          <w:numId w:val="6"/>
+        </w:numPr>
+      </w:pPr>
+      <w:r>
+        <w:t>Max 5 courses per semester</w:t>
+      </w:r>
+    </w:p>
+    <w:p>
+      <w:pPr>
+        <w:pStyle w:val="ListParagraph"/>
+        <w:numPr>
+          <w:ilvl w:val="0"/>
+          <w:numId w:val="6"/>
+        </w:numPr>
+      </w:pPr>
+      <w:r>
+        <w:t>No duplicate enrolment</w:t>
+      </w:r>
+    </w:p>
+    <w:p>
+      <w:pPr>
+        <w:pStyle w:val="ListParagraph"/>
+        <w:numPr>
+          <w:ilvl w:val="0"/>
+          <w:numId w:val="6"/>
+        </w:numPr>
+      </w:pPr>
+      <w:r>
+        <w:t>Enrolment deadline enforced</w:t>
+      </w:r>
+    </w:p>
+    <w:p>
+      <w:pPr>
+        <w:pStyle w:val="ListParagraph"/>
+        <w:numPr>
+          <w:ilvl w:val="0"/>
+          <w:numId w:val="6"/>
+        </w:numPr>
+      </w:pPr>
+      <w:r>
+        <w:t xml:space="preserve">An overview of the courses a student is enrolled in must be visible </w:t>
+      </w:r>
+    </w:p>
+    <w:p>
+      <w:pPr>
+        <w:pStyle w:val="ListParagraph"/>
+        <w:numPr>
+          <w:ilvl w:val="0"/>
+          <w:numId w:val="6"/>
+        </w:numPr>
+      </w:pPr>
+      <w:r>
+        <w:rPr>
+          <w:i/>
+          <w:iCs/>
+        </w:rPr>
+        <w:t>Testability</w:t>
+      </w:r>
+      <w:r>
+        <w:t xml:space="preserve">: </w:t>
+      </w:r>
+      <w:r>
+        <w:t xml:space="preserve">Verify that the course enrolment page provides a list of modules that students can enrol for according to the qualification the user is enrolled for. Verify that only 5 modules can be enrolled in, </w:t>
+      </w:r>
+      <w:r>
+        <w:t xml:space="preserve">and </w:t>
+      </w:r>
+      <w:r>
+        <w:t xml:space="preserve">attempts to enrol for more than 5 modules trigger a clear validation message indicating only 5 modules can be enrolled in. </w:t>
+      </w:r>
+    </w:p>
+    <w:p>
+      <w:pPr>
+        <w:pStyle w:val="ListParagraph"/>
+      </w:pPr>
+    </w:p>
+    <w:p>
+      <w:pPr>
+        <w:pStyle w:val="ListParagraph"/>
+        <w:rPr>
+          <w:u w:val="single"/>
+        </w:rPr>
+      </w:pPr>
+      <w:r>
+        <w:rPr>
+          <w:u w:val="single"/>
+        </w:rPr>
+        <w:t xml:space="preserve">FR4 </w:t>
+      </w:r>
+      <w:r>
+        <w:rPr>
+          <w:u w:val="single"/>
+        </w:rPr>
+        <w:t>-</w:t>
+      </w:r>
+      <w:r>
+        <w:rPr>
+          <w:u w:val="single"/>
+        </w:rPr>
+        <w:t xml:space="preserve"> Grade Viewing</w:t>
+      </w:r>
+    </w:p>
+    <w:p>
+      <w:pPr>
+        <w:pStyle w:val="ListParagraph"/>
+        <w:numPr>
+          <w:ilvl w:val="0"/>
+          <w:numId w:val="7"/>
+        </w:numPr>
+      </w:pPr>
+      <w:r>
+        <w:t>Students can only see their own grades</w:t>
+      </w:r>
+    </w:p>
+    <w:p>
+      <w:pPr>
+        <w:pStyle w:val="ListParagraph"/>
+        <w:numPr>
+          <w:ilvl w:val="0"/>
+          <w:numId w:val="7"/>
+        </w:numPr>
+      </w:pPr>
+      <w:r>
+        <w:t>Students can see the courses they are enrolled in and the grades for those courses</w:t>
+      </w:r>
+    </w:p>
+    <w:p>
+      <w:pPr>
+        <w:pStyle w:val="ListParagraph"/>
+        <w:numPr>
+          <w:ilvl w:val="0"/>
+          <w:numId w:val="7"/>
         </w:numPr>
         <w:rPr>
           <w:u w:val="single"/>
@@ -256,14 +1868,83 @@
       </w:pPr>
       <w:r>
         <w:rPr>
+          <w:i/>
+          <w:iCs/>
+        </w:rPr>
+        <w:t>Testability</w:t>
+      </w:r>
+      <w:r>
+        <w:t xml:space="preserve">: </w:t>
+      </w:r>
+      <w:r>
+        <w:t>Verify that the grade viewing page displays the modules that the user is enrolled in, as well as the grades they received in each module. Where module grades have not yet been received, a message indicating that grades are yet to come must be displayed.</w:t>
+      </w:r>
+    </w:p>
+    <w:p>
+      <w:pPr>
+        <w:pStyle w:val="ListParagraph"/>
+        <w:rPr>
           <w:u w:val="single"/>
         </w:rPr>
-        <w:t>Requirements</w:t>
-      </w:r>
-    </w:p>
-    <w:p>
-      <w:pPr>
-        <w:pStyle w:val="ListParagraph"/>
+      </w:pPr>
+    </w:p>
+    <w:p>
+      <w:pPr>
+        <w:pStyle w:val="ListParagraph"/>
+        <w:rPr>
+          <w:u w:val="single"/>
+        </w:rPr>
+      </w:pPr>
+      <w:r>
+        <w:rPr>
+          <w:u w:val="single"/>
+        </w:rPr>
+        <w:t xml:space="preserve">FR5 </w:t>
+      </w:r>
+      <w:r>
+        <w:rPr>
+          <w:u w:val="single"/>
+        </w:rPr>
+        <w:t>-</w:t>
+      </w:r>
+      <w:r>
+        <w:rPr>
+          <w:u w:val="single"/>
+        </w:rPr>
+        <w:t xml:space="preserve"> Profile Update</w:t>
+      </w:r>
+    </w:p>
+    <w:p>
+      <w:pPr>
+        <w:pStyle w:val="ListParagraph"/>
+        <w:numPr>
+          <w:ilvl w:val="0"/>
+          <w:numId w:val="8"/>
+        </w:numPr>
+      </w:pPr>
+      <w:r>
+        <w:t>Editable: name, phone, address</w:t>
+      </w:r>
+    </w:p>
+    <w:p>
+      <w:pPr>
+        <w:pStyle w:val="ListParagraph"/>
+        <w:numPr>
+          <w:ilvl w:val="0"/>
+          <w:numId w:val="8"/>
+        </w:numPr>
+      </w:pPr>
+      <w:r>
+        <w:t>A password reset section must be presented</w:t>
+      </w:r>
+    </w:p>
+    <w:p>
+      <w:pPr>
+        <w:pStyle w:val="ListParagraph"/>
+        <w:numPr>
+          <w:ilvl w:val="0"/>
+          <w:numId w:val="8"/>
+        </w:numPr>
         <w:rPr>
           <w:b/>
           <w:bCs/>
@@ -273,458 +1954,33 @@
       </w:pPr>
       <w:r>
         <w:rPr>
-          <w:b/>
-          <w:bCs/>
-          <w:i/>
-          <w:iCs/>
-          <w:highlight w:val="cyan"/>
-        </w:rPr>
-        <w:t>Functional Requirements</w:t>
-      </w:r>
-    </w:p>
-    <w:p>
-      <w:pPr>
-        <w:pStyle w:val="ListParagraph"/>
-        <w:rPr>
-          <w:u w:val="single"/>
-        </w:rPr>
-      </w:pPr>
-      <w:r>
-        <w:rPr>
-          <w:u w:val="single"/>
-        </w:rPr>
-        <w:t>FR1 - User Registration</w:t>
-      </w:r>
-    </w:p>
-    <w:p>
-      <w:pPr>
-        <w:pStyle w:val="ListParagraph"/>
-        <w:numPr>
-          <w:ilvl w:val="0"/>
-          <w:numId w:val="3"/>
-        </w:numPr>
-      </w:pPr>
-      <w:r>
-        <w:t>Students must register with:</w:t>
-      </w:r>
-    </w:p>
-    <w:p>
-      <w:pPr>
-        <w:pStyle w:val="ListParagraph"/>
-        <w:numPr>
-          <w:ilvl w:val="1"/>
-          <w:numId w:val="4"/>
-        </w:numPr>
-      </w:pPr>
-      <w:r>
-        <w:t>Email (valid format)</w:t>
-      </w:r>
-    </w:p>
-    <w:p>
-      <w:pPr>
-        <w:pStyle w:val="ListParagraph"/>
-        <w:numPr>
-          <w:ilvl w:val="1"/>
-          <w:numId w:val="4"/>
-        </w:numPr>
-      </w:pPr>
-      <w:r>
-        <w:t>Password (8</w:t>
-      </w:r>
-      <w:r>
-        <w:t>-</w:t>
-      </w:r>
-      <w:r>
-        <w:t>16 chars)</w:t>
-      </w:r>
-    </w:p>
-    <w:p>
-      <w:pPr>
-        <w:pStyle w:val="ListParagraph"/>
-        <w:numPr>
-          <w:ilvl w:val="1"/>
-          <w:numId w:val="4"/>
-        </w:numPr>
-      </w:pPr>
-      <w:r>
-        <w:t>Student ID (numeric)</w:t>
-      </w:r>
-    </w:p>
-    <w:p>
-      <w:pPr>
-        <w:pStyle w:val="ListParagraph"/>
-        <w:numPr>
-          <w:ilvl w:val="0"/>
-          <w:numId w:val="4"/>
-        </w:numPr>
-      </w:pPr>
-      <w:r>
-        <w:t>A register button must be present to capture information provided by the student</w:t>
-      </w:r>
-    </w:p>
-    <w:p>
-      <w:pPr>
-        <w:pStyle w:val="ListParagraph"/>
-        <w:numPr>
-          <w:ilvl w:val="0"/>
-          <w:numId w:val="4"/>
-        </w:numPr>
-      </w:pPr>
-      <w:r>
-        <w:t>A login button must be present to redirect students who have already registered to the login page</w:t>
-      </w:r>
-    </w:p>
-    <w:p>
-      <w:pPr>
-        <w:pStyle w:val="ListParagraph"/>
-        <w:numPr>
-          <w:ilvl w:val="0"/>
-          <w:numId w:val="4"/>
-        </w:numPr>
-      </w:pPr>
-      <w:r>
-        <w:rPr>
-          <w:i/>
-          <w:iCs/>
-        </w:rPr>
-        <w:lastRenderedPageBreak/>
-        <w:t>Test</w:t>
-      </w:r>
-      <w:r>
-        <w:rPr>
-          <w:i/>
-          <w:iCs/>
-        </w:rPr>
-        <w:t>a</w:t>
-      </w:r>
-      <w:r>
-        <w:rPr>
-          <w:i/>
-          <w:iCs/>
-        </w:rPr>
-        <w:t>bility</w:t>
-      </w:r>
-      <w:r>
-        <w:t>: The student should be able to provide an email, password, and student ID in the correct format and be successfully registered and redirected to the home page of the portal. Should the student be unable to provide this, they must be notified of where they are not providing the right information or be asked to log in if they are already a registered user.</w:t>
-      </w:r>
-    </w:p>
-    <w:p>
-      <w:pPr>
-        <w:pStyle w:val="ListParagraph"/>
-      </w:pPr>
-    </w:p>
-    <w:p>
-      <w:pPr>
-        <w:pStyle w:val="ListParagraph"/>
-      </w:pPr>
-    </w:p>
-    <w:p>
-      <w:pPr>
-        <w:pStyle w:val="ListParagraph"/>
-        <w:rPr>
-          <w:u w:val="single"/>
-        </w:rPr>
-      </w:pPr>
-      <w:r>
-        <w:rPr>
-          <w:u w:val="single"/>
-        </w:rPr>
-        <w:t xml:space="preserve">FR2 </w:t>
-      </w:r>
-      <w:r>
-        <w:rPr>
-          <w:u w:val="single"/>
-        </w:rPr>
-        <w:t xml:space="preserve">- </w:t>
-      </w:r>
-      <w:r>
-        <w:rPr>
-          <w:u w:val="single"/>
-        </w:rPr>
-        <w:t>Login System</w:t>
-      </w:r>
-    </w:p>
-    <w:p>
-      <w:pPr>
-        <w:pStyle w:val="ListParagraph"/>
-        <w:numPr>
-          <w:ilvl w:val="0"/>
-          <w:numId w:val="5"/>
-        </w:numPr>
-      </w:pPr>
-      <w:r>
-        <w:t>Valid credentials required</w:t>
-      </w:r>
-    </w:p>
-    <w:p>
-      <w:pPr>
-        <w:pStyle w:val="ListParagraph"/>
-        <w:numPr>
-          <w:ilvl w:val="0"/>
-          <w:numId w:val="5"/>
-        </w:numPr>
-      </w:pPr>
-      <w:r>
-        <w:t>Account locks after 5 failed attempts</w:t>
-      </w:r>
-    </w:p>
-    <w:p>
-      <w:pPr>
-        <w:pStyle w:val="ListParagraph"/>
-        <w:numPr>
-          <w:ilvl w:val="0"/>
-          <w:numId w:val="5"/>
-        </w:numPr>
-      </w:pPr>
-      <w:r>
-        <w:t>A login button must be present to capture credentials supplied by the student and redirect the student to the home page of the portal</w:t>
-      </w:r>
-    </w:p>
-    <w:p>
-      <w:pPr>
-        <w:pStyle w:val="ListParagraph"/>
-        <w:numPr>
-          <w:ilvl w:val="0"/>
-          <w:numId w:val="5"/>
-        </w:numPr>
-      </w:pPr>
-      <w:r>
-        <w:t>A register button must be present to redirect students to the registration page if they have not yet registered for an account</w:t>
-      </w:r>
-    </w:p>
-    <w:p>
-      <w:pPr>
-        <w:pStyle w:val="ListParagraph"/>
-        <w:numPr>
-          <w:ilvl w:val="0"/>
-          <w:numId w:val="5"/>
-        </w:numPr>
-      </w:pPr>
-      <w:r>
-        <w:rPr>
           <w:i/>
           <w:iCs/>
         </w:rPr>
         <w:t>Testability</w:t>
       </w:r>
       <w:r>
-        <w:t>: The student should be able to log into their account, provided they supply the correct credentials ( email and password). Should they provide incorrect credentials, they must be notified and prompted to try to provide their credentials again. The incorrect credentials that were provided initially should be cleared.</w:t>
-      </w:r>
-    </w:p>
-    <w:p>
-      <w:pPr>
-        <w:pStyle w:val="ListParagraph"/>
-      </w:pPr>
-    </w:p>
-    <w:p>
-      <w:pPr>
-        <w:pStyle w:val="ListParagraph"/>
+        <w:t xml:space="preserve">: </w:t>
+      </w:r>
+      <w:r>
+        <w:t xml:space="preserve">Verify the profile update form </w:t>
+      </w:r>
+      <w:r>
+        <w:t>allows the name, address, and phone values to be edited. Verify that upon clicking on the update button, edited fields display the changes that were made</w:t>
+      </w:r>
+      <w:r>
+        <w:t xml:space="preserve">. </w:t>
+      </w:r>
+    </w:p>
+    <w:p>
+      <w:pPr>
+        <w:pStyle w:val="Heading2"/>
+      </w:pPr>
+      <w:r>
         <w:rPr>
-          <w:u w:val="single"/>
+          <w:highlight w:val="cyan"/>
         </w:rPr>
-      </w:pPr>
-      <w:r>
-        <w:rPr>
-          <w:u w:val="single"/>
-        </w:rPr>
-        <w:t xml:space="preserve">FR3 </w:t>
-      </w:r>
-      <w:r>
-        <w:rPr>
-          <w:u w:val="single"/>
-        </w:rPr>
-        <w:t xml:space="preserve">- </w:t>
-      </w:r>
-      <w:r>
-        <w:rPr>
-          <w:u w:val="single"/>
-        </w:rPr>
-        <w:t>Course Enrolment</w:t>
-      </w:r>
-    </w:p>
-    <w:p>
-      <w:pPr>
-        <w:pStyle w:val="ListParagraph"/>
-        <w:numPr>
-          <w:ilvl w:val="0"/>
-          <w:numId w:val="6"/>
-        </w:numPr>
-      </w:pPr>
-      <w:r>
-        <w:t>Max 5 courses per semester</w:t>
-      </w:r>
-    </w:p>
-    <w:p>
-      <w:pPr>
-        <w:pStyle w:val="ListParagraph"/>
-        <w:numPr>
-          <w:ilvl w:val="0"/>
-          <w:numId w:val="6"/>
-        </w:numPr>
-      </w:pPr>
-      <w:r>
-        <w:t>No duplicate enrolment</w:t>
-      </w:r>
-    </w:p>
-    <w:p>
-      <w:pPr>
-        <w:pStyle w:val="ListParagraph"/>
-        <w:numPr>
-          <w:ilvl w:val="0"/>
-          <w:numId w:val="6"/>
-        </w:numPr>
-      </w:pPr>
-      <w:r>
-        <w:t>Enrolment deadline enforced</w:t>
-      </w:r>
-    </w:p>
-    <w:p>
-      <w:pPr>
-        <w:pStyle w:val="ListParagraph"/>
-        <w:numPr>
-          <w:ilvl w:val="0"/>
-          <w:numId w:val="6"/>
-        </w:numPr>
-      </w:pPr>
-      <w:r>
-        <w:t xml:space="preserve">An overview of the courses a student is enrolled in must be visible </w:t>
-      </w:r>
-    </w:p>
-    <w:p>
-      <w:pPr>
-        <w:pStyle w:val="ListParagraph"/>
-        <w:numPr>
-          <w:ilvl w:val="0"/>
-          <w:numId w:val="6"/>
-        </w:numPr>
-      </w:pPr>
-      <w:r>
-        <w:rPr>
-          <w:i/>
-          <w:iCs/>
-        </w:rPr>
-        <w:t>Testability</w:t>
-      </w:r>
-      <w:r>
-        <w:t>: The student should be provided with a list of all modules they are allowed to enrol for according to the qualification they are enrolled in, and they must be provided with the ability to select 5 courses they want to enrol in. This functionality should only be available before the enrolment deadline.</w:t>
-      </w:r>
-    </w:p>
-    <w:p>
-      <w:pPr>
-        <w:pStyle w:val="ListParagraph"/>
-      </w:pPr>
-    </w:p>
-    <w:p>
-      <w:pPr>
-        <w:pStyle w:val="ListParagraph"/>
-        <w:rPr>
-          <w:u w:val="single"/>
-        </w:rPr>
-      </w:pPr>
-      <w:r>
-        <w:rPr>
-          <w:u w:val="single"/>
-        </w:rPr>
-        <w:t xml:space="preserve">FR4 </w:t>
-      </w:r>
-      <w:r>
-        <w:rPr>
-          <w:u w:val="single"/>
-        </w:rPr>
-        <w:t>-</w:t>
-      </w:r>
-      <w:r>
-        <w:rPr>
-          <w:u w:val="single"/>
-        </w:rPr>
-        <w:t xml:space="preserve"> Grade Viewing</w:t>
-      </w:r>
-    </w:p>
-    <w:p>
-      <w:pPr>
-        <w:pStyle w:val="ListParagraph"/>
-        <w:numPr>
-          <w:ilvl w:val="0"/>
-          <w:numId w:val="7"/>
-        </w:numPr>
-      </w:pPr>
-      <w:r>
-        <w:t>Students can only see their own grades</w:t>
-      </w:r>
-    </w:p>
-    <w:p>
-      <w:pPr>
-        <w:pStyle w:val="ListParagraph"/>
-        <w:numPr>
-          <w:ilvl w:val="0"/>
-          <w:numId w:val="7"/>
-        </w:numPr>
-      </w:pPr>
-      <w:r>
-        <w:t>Students can see the courses they are enrolled in and the grades for those courses</w:t>
-      </w:r>
-    </w:p>
-    <w:p>
-      <w:pPr>
-        <w:pStyle w:val="ListParagraph"/>
-        <w:numPr>
-          <w:ilvl w:val="0"/>
-          <w:numId w:val="7"/>
-        </w:numPr>
-      </w:pPr>
-      <w:r>
-        <w:t>Testability: The student should be able to view the grades for the courses they are enrolled in when they have been made available by the lecturers.</w:t>
-      </w:r>
-    </w:p>
-    <w:p>
-      <w:pPr>
-        <w:pStyle w:val="ListParagraph"/>
-      </w:pPr>
-    </w:p>
-    <w:p>
-      <w:pPr>
-        <w:pStyle w:val="ListParagraph"/>
-      </w:pPr>
-    </w:p>
-    <w:p>
-      <w:pPr>
-        <w:pStyle w:val="ListParagraph"/>
-      </w:pPr>
-    </w:p>
-    <w:p>
-      <w:pPr>
-        <w:pStyle w:val="ListParagraph"/>
-      </w:pPr>
-    </w:p>
-    <w:p>
-      <w:pPr>
-        <w:pStyle w:val="ListParagraph"/>
-      </w:pPr>
-    </w:p>
-    <w:p>
-      <w:pPr>
-        <w:pStyle w:val="ListParagraph"/>
-        <w:rPr>
-          <w:u w:val="single"/>
-        </w:rPr>
-      </w:pPr>
-      <w:r>
-        <w:rPr>
-          <w:u w:val="single"/>
-        </w:rPr>
-        <w:t xml:space="preserve">FR5 </w:t>
-      </w:r>
-      <w:r>
-        <w:rPr>
-          <w:u w:val="single"/>
-        </w:rPr>
-        <w:t>-</w:t>
-      </w:r>
-      <w:r>
-        <w:rPr>
-          <w:u w:val="single"/>
-        </w:rPr>
-        <w:t xml:space="preserve"> Profile Update</w:t>
+        <w:t>Non-functional Requirements</w:t>
       </w:r>
     </w:p>
     <w:p>
@@ -736,7 +1992,7 @@
         </w:numPr>
       </w:pPr>
       <w:r>
-        <w:t>Editable: name, phone, address</w:t>
+        <w:t>Page load &lt; 3 seconds</w:t>
       </w:r>
     </w:p>
     <w:p>
@@ -748,7 +2004,10 @@
         </w:numPr>
       </w:pPr>
       <w:r>
-        <w:t>A password reset section must be presented</w:t>
+        <w:t>Support 1,000 concurrent users</w:t>
+      </w:r>
+      <w:r>
+        <w:t xml:space="preserve"> (out of scope of testing) </w:t>
       </w:r>
     </w:p>
     <w:p>
@@ -760,33 +2019,10 @@
         </w:numPr>
       </w:pPr>
       <w:r>
-        <w:t>Testability: The student should be able to change only the name, address, and phone values of their profile. Upon updating them, the changes should be reflected on their profile display.</w:t>
-      </w:r>
-    </w:p>
-    <w:p>
-      <w:pPr>
-        <w:pStyle w:val="ListParagraph"/>
-      </w:pPr>
-    </w:p>
-    <w:p>
-      <w:pPr>
-        <w:pStyle w:val="ListParagraph"/>
-        <w:rPr>
-          <w:b/>
-          <w:bCs/>
-          <w:i/>
-          <w:iCs/>
-        </w:rPr>
-      </w:pPr>
-      <w:r>
-        <w:rPr>
-          <w:b/>
-          <w:bCs/>
-          <w:i/>
-          <w:iCs/>
-          <w:highlight w:val="cyan"/>
-        </w:rPr>
-        <w:t>Non-functional Requirements</w:t>
+        <w:t>Secure password encryption</w:t>
+      </w:r>
+      <w:r>
+        <w:t xml:space="preserve"> (out of scope of testing) </w:t>
       </w:r>
     </w:p>
     <w:p>
@@ -798,63 +2034,25 @@
         </w:numPr>
       </w:pPr>
       <w:r>
-        <w:t>Page load &lt; 3 seconds</w:t>
-      </w:r>
-    </w:p>
-    <w:p>
-      <w:pPr>
-        <w:pStyle w:val="ListParagraph"/>
-        <w:numPr>
-          <w:ilvl w:val="0"/>
-          <w:numId w:val="8"/>
-        </w:numPr>
-      </w:pPr>
-      <w:r>
-        <w:t>Support 1,000 concurrent users</w:t>
-      </w:r>
-      <w:r>
-        <w:t xml:space="preserve"> ( out of scope of testing ) </w:t>
-      </w:r>
-    </w:p>
-    <w:p>
-      <w:pPr>
-        <w:pStyle w:val="ListParagraph"/>
-        <w:numPr>
-          <w:ilvl w:val="0"/>
-          <w:numId w:val="8"/>
-        </w:numPr>
-      </w:pPr>
-      <w:r>
-        <w:t>Secure password encryption</w:t>
-      </w:r>
-      <w:r>
-        <w:t xml:space="preserve"> ( out of scope of testing ) </w:t>
-      </w:r>
-    </w:p>
-    <w:p>
-      <w:pPr>
-        <w:pStyle w:val="ListParagraph"/>
-        <w:numPr>
-          <w:ilvl w:val="0"/>
-          <w:numId w:val="8"/>
-        </w:numPr>
-      </w:pPr>
-      <w:r>
         <w:t>Mobile responsive</w:t>
       </w:r>
+      <w:r>
+        <w:t>ness</w:t>
+      </w:r>
     </w:p>
     <w:p/>
     <w:p>
       <w:pPr>
-        <w:pStyle w:val="ListParagraph"/>
-        <w:numPr>
-          <w:ilvl w:val="0"/>
-          <w:numId w:val="1"/>
-        </w:numPr>
+        <w:pStyle w:val="Heading1"/>
       </w:pPr>
       <w:r>
         <w:t xml:space="preserve">Risks </w:t>
       </w:r>
+    </w:p>
+    <w:p>
+      <w:pPr>
+        <w:pStyle w:val="ListParagraph"/>
+      </w:pPr>
     </w:p>
     <w:tbl>
       <w:tblPr>
@@ -953,7 +2151,7 @@
           </w:tcPr>
           <w:p>
             <w:r>
-              <w:t>Duplicate user registration – we run the risk of the same student registering an account twice.</w:t>
+              <w:t xml:space="preserve">Duplicate user registration </w:t>
             </w:r>
           </w:p>
         </w:tc>
@@ -1006,13 +2204,16 @@
           </w:tcPr>
           <w:p>
             <w:r>
-              <w:t>Passwords exceeding 16 characters – there is usually no maximum character cap to password creation, only a minimum. A character cap might not be innate behaviour</w:t>
-            </w:r>
-            <w:r>
-              <w:t>,</w:t>
-            </w:r>
-            <w:r>
-              <w:t xml:space="preserve"> which produces the risk of users creating passwords that exceed 16 characters.</w:t>
+              <w:t xml:space="preserve">Passwords </w:t>
+            </w:r>
+            <w:r>
+              <w:t xml:space="preserve">lower than or </w:t>
+            </w:r>
+            <w:r>
+              <w:t>exceeding 16 characters</w:t>
+            </w:r>
+            <w:r>
+              <w:t>.</w:t>
             </w:r>
           </w:p>
         </w:tc>
@@ -1054,7 +2255,7 @@
               <w:ind w:left="0"/>
             </w:pPr>
             <w:r>
-              <w:t>Remove the cap on the number of characters a password should have</w:t>
+              <w:t>Provide test data that tests the system's response to various character lengths.</w:t>
             </w:r>
           </w:p>
         </w:tc>
@@ -1106,7 +2307,15 @@
               <w:t>,</w:t>
             </w:r>
             <w:r>
-              <w:t xml:space="preserve"> and students often did not take the time to strengthen it </w:t>
+              <w:t xml:space="preserve"> and students often did not take the time to strengthen </w:t>
+            </w:r>
+            <w:proofErr w:type="spellStart"/>
+            <w:r>
+              <w:t>it</w:t>
+            </w:r>
+            <w:proofErr w:type="spellEnd"/>
+            <w:r>
+              <w:t xml:space="preserve"> </w:t>
             </w:r>
             <w:r>
               <w:t>post-registration</w:t>
@@ -1154,7 +2363,7 @@
               <w:ind w:left="0"/>
             </w:pPr>
             <w:r>
-              <w:t>Advise students to not share their log in credentials with anyone</w:t>
+              <w:t>Verify enforcement of strong authentication controls</w:t>
             </w:r>
           </w:p>
         </w:tc>
@@ -1224,7 +2433,7 @@
               <w:ind w:left="0"/>
             </w:pPr>
             <w:r>
-              <w:t>Decrease attempts for incorrect credentials to three attempts.</w:t>
+              <w:t>Verify lockout triggers after defined attempts.</w:t>
             </w:r>
           </w:p>
         </w:tc>
@@ -1300,7 +2509,7 @@
               <w:ind w:left="0"/>
             </w:pPr>
             <w:r>
-              <w:t>Make enrolments for each semester unique and not linked to any previous courses taken in the past</w:t>
+              <w:t>Test re-enrolment scenarios across semesters.</w:t>
             </w:r>
           </w:p>
         </w:tc>
@@ -1366,7 +2575,7 @@
               <w:ind w:left="0"/>
             </w:pPr>
             <w:r>
-              <w:t>This is a human responsibility that can’t be mitigated by developers</w:t>
+              <w:t>Verify that the grades that are displayed fall within the grade system that is used by the university.</w:t>
             </w:r>
           </w:p>
         </w:tc>
@@ -1454,7 +2663,7 @@
               <w:ind w:left="0"/>
             </w:pPr>
             <w:r>
-              <w:t>To be discussed</w:t>
+              <w:t>Load testing at expected peak usage.</w:t>
             </w:r>
           </w:p>
         </w:tc>
@@ -1472,11 +2681,7 @@
     </w:p>
     <w:p>
       <w:pPr>
-        <w:pStyle w:val="ListParagraph"/>
-        <w:numPr>
-          <w:ilvl w:val="0"/>
-          <w:numId w:val="1"/>
-        </w:numPr>
+        <w:pStyle w:val="Heading1"/>
       </w:pPr>
       <w:r>
         <w:t>Priority</w:t>
@@ -1649,13 +2854,16 @@
           </w:tcPr>
           <w:p>
             <w:r>
-              <w:t xml:space="preserve">FR4 </w:t>
-            </w:r>
-            <w:r>
-              <w:t xml:space="preserve">- </w:t>
-            </w:r>
-            <w:r>
-              <w:t xml:space="preserve">Grade Viewing </w:t>
+              <w:t xml:space="preserve">FR3 </w:t>
+            </w:r>
+            <w:r>
+              <w:t>-</w:t>
+            </w:r>
+            <w:r>
+              <w:t xml:space="preserve"> Course </w:t>
+            </w:r>
+            <w:r>
+              <w:t>Enrolment</w:t>
             </w:r>
           </w:p>
         </w:tc>
@@ -1675,7 +2883,7 @@
           </w:tcPr>
           <w:p>
             <w:r>
-              <w:t>Low</w:t>
+              <w:t>Medium</w:t>
             </w:r>
           </w:p>
         </w:tc>
@@ -1697,16 +2905,13 @@
           </w:tcPr>
           <w:p>
             <w:r>
-              <w:t xml:space="preserve">FR3 </w:t>
-            </w:r>
-            <w:r>
-              <w:t>-</w:t>
-            </w:r>
-            <w:r>
-              <w:t xml:space="preserve"> Course </w:t>
-            </w:r>
-            <w:r>
-              <w:t>Enrolment</w:t>
+              <w:t xml:space="preserve">FR4 </w:t>
+            </w:r>
+            <w:r>
+              <w:t xml:space="preserve">- </w:t>
+            </w:r>
+            <w:r>
+              <w:t>Grade Viewing</w:t>
             </w:r>
           </w:p>
         </w:tc>
@@ -1716,7 +2921,7 @@
           </w:tcPr>
           <w:p>
             <w:r>
-              <w:t>Medium</w:t>
+              <w:t>High</w:t>
             </w:r>
           </w:p>
         </w:tc>
@@ -1726,7 +2931,7 @@
           </w:tcPr>
           <w:p>
             <w:r>
-              <w:t>Medium</w:t>
+              <w:t>Low</w:t>
             </w:r>
           </w:p>
         </w:tc>
@@ -1764,7 +2969,7 @@
           </w:tcPr>
           <w:p>
             <w:r>
-              <w:t>Lowe</w:t>
+              <w:t>Low</w:t>
             </w:r>
           </w:p>
         </w:tc>
@@ -1787,16 +2992,27 @@
       </w:r>
     </w:p>
     <w:p>
-      <w:pPr>
-        <w:pStyle w:val="ListParagraph"/>
-        <w:numPr>
-          <w:ilvl w:val="0"/>
-          <w:numId w:val="1"/>
-        </w:numPr>
+      <w:r>
+        <w:t>The login and registration unit has the highest priority as it is the gateway to the rest of the portal. The grade viewing and course enrolment unit follows because it performs the key functionality for the portal. The profile update unit has the least priority because it is not a key functionality for the portal.</w:t>
+      </w:r>
+    </w:p>
+    <w:p>
+      <w:r>
+        <w:t>The course enrolment unit has a higher priority than the grade viewing unit because it has a higher risk level than the grade viewing unit.</w:t>
+      </w:r>
+    </w:p>
+    <w:p>
+      <w:pPr>
+        <w:pStyle w:val="Heading1"/>
       </w:pPr>
       <w:r>
         <w:t>Testing Methods</w:t>
       </w:r>
+    </w:p>
+    <w:p>
+      <w:pPr>
+        <w:pStyle w:val="ListParagraph"/>
+      </w:pPr>
     </w:p>
     <w:p>
       <w:pPr>
@@ -1902,7 +3118,10 @@
         </w:numPr>
       </w:pPr>
       <w:r>
-        <w:t xml:space="preserve">Automation testing will begin when all manual tests have been carried out </w:t>
+        <w:t xml:space="preserve">Automation testing will </w:t>
+      </w:r>
+      <w:r>
+        <w:t>be carried out in parallel to manual testing</w:t>
       </w:r>
     </w:p>
     <w:p>
@@ -1920,18 +3139,7 @@
     <w:p>
       <w:pPr>
         <w:pStyle w:val="ListParagraph"/>
-        <w:numPr>
-          <w:ilvl w:val="1"/>
-          <w:numId w:val="17"/>
-        </w:numPr>
-      </w:pPr>
-      <w:r>
-        <w:t>The goal for automation is to automate all regression testing</w:t>
-      </w:r>
-    </w:p>
-    <w:p>
-      <w:pPr>
-        <w:pStyle w:val="ListParagraph"/>
+        <w:ind w:left="1440"/>
       </w:pPr>
     </w:p>
     <w:p>
@@ -2054,6 +3262,9 @@
             <w:r>
               <w:t>Different inputs will be provided to test the functionality of each functional requirement when unit testing is being done. Equivalence partitioning will assist in testing the various input possibilities.</w:t>
             </w:r>
+            <w:r>
+              <w:t xml:space="preserve"> </w:t>
+            </w:r>
           </w:p>
         </w:tc>
       </w:tr>
@@ -2188,11 +3399,7 @@
     </w:p>
     <w:p>
       <w:pPr>
-        <w:pStyle w:val="ListParagraph"/>
-        <w:numPr>
-          <w:ilvl w:val="0"/>
-          <w:numId w:val="1"/>
-        </w:numPr>
+        <w:pStyle w:val="Heading1"/>
       </w:pPr>
       <w:r>
         <w:t>Tools and environments</w:t>
@@ -2221,7 +3428,7 @@
         <w:t>Web browsers – Chrome</w:t>
       </w:r>
       <w:r>
-        <w:t xml:space="preserve">, Safari, and </w:t>
+        <w:t xml:space="preserve">, and </w:t>
       </w:r>
       <w:r>
         <w:t>Firefox</w:t>
@@ -2267,17 +3474,7 @@
     </w:p>
     <w:p>
       <w:pPr>
-        <w:pStyle w:val="ListParagraph"/>
-        <w:ind w:left="1440"/>
-      </w:pPr>
-    </w:p>
-    <w:p>
-      <w:pPr>
-        <w:pStyle w:val="ListParagraph"/>
-        <w:numPr>
-          <w:ilvl w:val="0"/>
-          <w:numId w:val="1"/>
-        </w:numPr>
+        <w:pStyle w:val="Heading1"/>
       </w:pPr>
       <w:r>
         <w:t>Entry Criteria</w:t>
@@ -2471,6 +3668,12 @@
       <w:r>
         <w:t xml:space="preserve"> and approved by the test lead</w:t>
       </w:r>
+    </w:p>
+    <w:p>
+      <w:pPr>
+        <w:pStyle w:val="ListParagraph"/>
+        <w:ind w:left="2160"/>
+      </w:pPr>
     </w:p>
     <w:p>
       <w:r>
@@ -2558,10 +3761,10 @@
                           <pic:cNvPicPr/>
                         </pic:nvPicPr>
                         <pic:blipFill>
-                          <a:blip r:embed="rId5">
+                          <a:blip r:embed="rId6">
                             <a:extLst>
                               <a:ext uri="{96DAC541-7B7A-43D3-8B79-37D633B846F1}">
-                                <asvg:svgBlip xmlns:asvg="http://schemas.microsoft.com/office/drawing/2016/SVG/main" r:embed="rId6"/>
+                                <asvg:svgBlip xmlns:asvg="http://schemas.microsoft.com/office/drawing/2016/SVG/main" r:embed="rId7"/>
                               </a:ext>
                             </a:extLst>
                           </a:blip>
@@ -2594,7 +3797,10 @@
           </w:tcPr>
           <w:p>
             <w:r>
-              <w:t>Requirements approved and signed by stakeholders</w:t>
+              <w:t>Requirements signed by stakeholders</w:t>
+            </w:r>
+            <w:r>
+              <w:t xml:space="preserve"> </w:t>
             </w:r>
           </w:p>
         </w:tc>
@@ -2623,10 +3829,10 @@
                           <pic:cNvPicPr/>
                         </pic:nvPicPr>
                         <pic:blipFill>
-                          <a:blip r:embed="rId5">
+                          <a:blip r:embed="rId6">
                             <a:extLst>
                               <a:ext uri="{96DAC541-7B7A-43D3-8B79-37D633B846F1}">
-                                <asvg:svgBlip xmlns:asvg="http://schemas.microsoft.com/office/drawing/2016/SVG/main" r:embed="rId6"/>
+                                <asvg:svgBlip xmlns:asvg="http://schemas.microsoft.com/office/drawing/2016/SVG/main" r:embed="rId7"/>
                               </a:ext>
                             </a:extLst>
                           </a:blip>
@@ -2659,7 +3865,7 @@
           </w:tcPr>
           <w:p>
             <w:r>
-              <w:t xml:space="preserve">Acceptance criteria reviewed by the test lead </w:t>
+              <w:t>Requirements reviewed and approved by the test lead</w:t>
             </w:r>
           </w:p>
         </w:tc>
@@ -2667,34 +3873,21 @@
           <w:tcPr>
             <w:tcW w:w="4508" w:type="dxa"/>
           </w:tcPr>
-          <w:p/>
-        </w:tc>
-      </w:tr>
-      <w:tr>
-        <w:tc>
-          <w:tcPr>
-            <w:tcW w:w="4508" w:type="dxa"/>
-          </w:tcPr>
-          <w:p>
-            <w:r>
-              <w:t>Acceptance criteria approved by the test lead</w:t>
-            </w:r>
-          </w:p>
-        </w:tc>
-        <w:tc>
-          <w:tcPr>
-            <w:tcW w:w="4508" w:type="dxa"/>
-          </w:tcPr>
-          <w:p>
+          <w:p>
+            <w:pPr>
+              <w:rPr>
+                <w:noProof/>
+              </w:rPr>
+            </w:pPr>
             <w:r>
               <w:rPr>
                 <w:noProof/>
               </w:rPr>
               <w:drawing>
-                <wp:inline distT="0" distB="0" distL="0" distR="0" wp14:anchorId="3F79C338" wp14:editId="3D4305F9">
+                <wp:inline distT="0" distB="0" distL="0" distR="0" wp14:anchorId="704D2274" wp14:editId="5A2FC123">
                   <wp:extent cx="266131" cy="266131"/>
                   <wp:effectExtent l="0" t="0" r="635" b="635"/>
-                  <wp:docPr id="1515594411" name="Graphic 1" descr="Checkmark with solid fill"/>
+                  <wp:docPr id="281576193" name="Graphic 1" descr="Checkmark with solid fill"/>
                   <wp:cNvGraphicFramePr>
                     <a:graphicFrameLocks xmlns:a="http://schemas.openxmlformats.org/drawingml/2006/main" noChangeAspect="1"/>
                   </wp:cNvGraphicFramePr>
@@ -2706,10 +3899,10 @@
                           <pic:cNvPicPr/>
                         </pic:nvPicPr>
                         <pic:blipFill>
-                          <a:blip r:embed="rId5">
+                          <a:blip r:embed="rId6">
                             <a:extLst>
                               <a:ext uri="{96DAC541-7B7A-43D3-8B79-37D633B846F1}">
-                                <asvg:svgBlip xmlns:asvg="http://schemas.microsoft.com/office/drawing/2016/SVG/main" r:embed="rId6"/>
+                                <asvg:svgBlip xmlns:asvg="http://schemas.microsoft.com/office/drawing/2016/SVG/main" r:embed="rId7"/>
                               </a:ext>
                             </a:extLst>
                           </a:blip>
@@ -2738,14 +3931,19 @@
       <w:tr>
         <w:tc>
           <w:tcPr>
-            <w:tcW w:w="9016" w:type="dxa"/>
-            <w:gridSpan w:val="2"/>
-          </w:tcPr>
-          <w:p>
-            <w:r>
-              <w:t>Environment readiness</w:t>
-            </w:r>
-          </w:p>
+            <w:tcW w:w="4508" w:type="dxa"/>
+          </w:tcPr>
+          <w:p>
+            <w:r>
+              <w:t xml:space="preserve">Acceptance criteria reviewed by the test lead </w:t>
+            </w:r>
+          </w:p>
+        </w:tc>
+        <w:tc>
+          <w:tcPr>
+            <w:tcW w:w="4508" w:type="dxa"/>
+          </w:tcPr>
+          <w:p/>
         </w:tc>
       </w:tr>
       <w:tr>
@@ -2755,7 +3953,7 @@
           </w:tcPr>
           <w:p>
             <w:r>
-              <w:t>Database available and accessible to the testing team</w:t>
+              <w:t>Acceptance criteria approved by the test lead</w:t>
             </w:r>
           </w:p>
         </w:tc>
@@ -2769,10 +3967,10 @@
                 <w:noProof/>
               </w:rPr>
               <w:drawing>
-                <wp:inline distT="0" distB="0" distL="0" distR="0" wp14:anchorId="75E33A6A" wp14:editId="2944DCE2">
+                <wp:inline distT="0" distB="0" distL="0" distR="0" wp14:anchorId="3F79C338" wp14:editId="3D4305F9">
                   <wp:extent cx="266131" cy="266131"/>
                   <wp:effectExtent l="0" t="0" r="635" b="635"/>
-                  <wp:docPr id="377429138" name="Graphic 1" descr="Checkmark with solid fill"/>
+                  <wp:docPr id="1515594411" name="Graphic 1" descr="Checkmark with solid fill"/>
                   <wp:cNvGraphicFramePr>
                     <a:graphicFrameLocks xmlns:a="http://schemas.openxmlformats.org/drawingml/2006/main" noChangeAspect="1"/>
                   </wp:cNvGraphicFramePr>
@@ -2784,10 +3982,10 @@
                           <pic:cNvPicPr/>
                         </pic:nvPicPr>
                         <pic:blipFill>
-                          <a:blip r:embed="rId5">
+                          <a:blip r:embed="rId6">
                             <a:extLst>
                               <a:ext uri="{96DAC541-7B7A-43D3-8B79-37D633B846F1}">
-                                <asvg:svgBlip xmlns:asvg="http://schemas.microsoft.com/office/drawing/2016/SVG/main" r:embed="rId6"/>
+                                <asvg:svgBlip xmlns:asvg="http://schemas.microsoft.com/office/drawing/2016/SVG/main" r:embed="rId7"/>
                               </a:ext>
                             </a:extLst>
                           </a:blip>
@@ -2816,19 +4014,14 @@
       <w:tr>
         <w:tc>
           <w:tcPr>
-            <w:tcW w:w="4508" w:type="dxa"/>
-          </w:tcPr>
-          <w:p>
-            <w:r>
-              <w:t>Web browsers installed and configured by the testing team</w:t>
-            </w:r>
-          </w:p>
-        </w:tc>
-        <w:tc>
-          <w:tcPr>
-            <w:tcW w:w="4508" w:type="dxa"/>
-          </w:tcPr>
-          <w:p/>
+            <w:tcW w:w="9016" w:type="dxa"/>
+            <w:gridSpan w:val="2"/>
+          </w:tcPr>
+          <w:p>
+            <w:r>
+              <w:t>Environment readiness</w:t>
+            </w:r>
+          </w:p>
         </w:tc>
       </w:tr>
       <w:tr>
@@ -2838,44 +4031,7 @@
           </w:tcPr>
           <w:p>
             <w:r>
-              <w:t xml:space="preserve">Eclipse </w:t>
-            </w:r>
-            <w:r>
-              <w:t xml:space="preserve">is </w:t>
-            </w:r>
-            <w:r>
-              <w:t>installed and configured by the testing team</w:t>
-            </w:r>
-          </w:p>
-        </w:tc>
-        <w:tc>
-          <w:tcPr>
-            <w:tcW w:w="4508" w:type="dxa"/>
-          </w:tcPr>
-          <w:p/>
-        </w:tc>
-      </w:tr>
-      <w:tr>
-        <w:tc>
-          <w:tcPr>
-            <w:tcW w:w="9016" w:type="dxa"/>
-            <w:gridSpan w:val="2"/>
-          </w:tcPr>
-          <w:p>
-            <w:r>
-              <w:t>Build stability</w:t>
-            </w:r>
-          </w:p>
-        </w:tc>
-      </w:tr>
-      <w:tr>
-        <w:tc>
-          <w:tcPr>
-            <w:tcW w:w="4508" w:type="dxa"/>
-          </w:tcPr>
-          <w:p>
-            <w:r>
-              <w:t>Build deployed successfully</w:t>
+              <w:t>Database available and accessible to the testing team</w:t>
             </w:r>
           </w:p>
         </w:tc>
@@ -2889,10 +4045,10 @@
                 <w:noProof/>
               </w:rPr>
               <w:drawing>
-                <wp:inline distT="0" distB="0" distL="0" distR="0" wp14:anchorId="2A709CB1" wp14:editId="3D37F896">
+                <wp:inline distT="0" distB="0" distL="0" distR="0" wp14:anchorId="75E33A6A" wp14:editId="2944DCE2">
                   <wp:extent cx="266131" cy="266131"/>
                   <wp:effectExtent l="0" t="0" r="635" b="635"/>
-                  <wp:docPr id="1005026009" name="Graphic 1" descr="Checkmark with solid fill"/>
+                  <wp:docPr id="377429138" name="Graphic 1" descr="Checkmark with solid fill"/>
                   <wp:cNvGraphicFramePr>
                     <a:graphicFrameLocks xmlns:a="http://schemas.openxmlformats.org/drawingml/2006/main" noChangeAspect="1"/>
                   </wp:cNvGraphicFramePr>
@@ -2904,10 +4060,10 @@
                           <pic:cNvPicPr/>
                         </pic:nvPicPr>
                         <pic:blipFill>
-                          <a:blip r:embed="rId5">
+                          <a:blip r:embed="rId6">
                             <a:extLst>
                               <a:ext uri="{96DAC541-7B7A-43D3-8B79-37D633B846F1}">
-                                <asvg:svgBlip xmlns:asvg="http://schemas.microsoft.com/office/drawing/2016/SVG/main" r:embed="rId6"/>
+                                <asvg:svgBlip xmlns:asvg="http://schemas.microsoft.com/office/drawing/2016/SVG/main" r:embed="rId7"/>
                               </a:ext>
                             </a:extLst>
                           </a:blip>
@@ -2936,12 +4092,54 @@
       <w:tr>
         <w:tc>
           <w:tcPr>
+            <w:tcW w:w="4508" w:type="dxa"/>
+          </w:tcPr>
+          <w:p>
+            <w:r>
+              <w:t>Web browsers installed and configured by the testing team</w:t>
+            </w:r>
+          </w:p>
+        </w:tc>
+        <w:tc>
+          <w:tcPr>
+            <w:tcW w:w="4508" w:type="dxa"/>
+          </w:tcPr>
+          <w:p/>
+        </w:tc>
+      </w:tr>
+      <w:tr>
+        <w:tc>
+          <w:tcPr>
+            <w:tcW w:w="4508" w:type="dxa"/>
+          </w:tcPr>
+          <w:p>
+            <w:r>
+              <w:t xml:space="preserve">Eclipse </w:t>
+            </w:r>
+            <w:r>
+              <w:t xml:space="preserve">is </w:t>
+            </w:r>
+            <w:r>
+              <w:t>installed and configured by the testing team</w:t>
+            </w:r>
+          </w:p>
+        </w:tc>
+        <w:tc>
+          <w:tcPr>
+            <w:tcW w:w="4508" w:type="dxa"/>
+          </w:tcPr>
+          <w:p/>
+        </w:tc>
+      </w:tr>
+      <w:tr>
+        <w:tc>
+          <w:tcPr>
             <w:tcW w:w="9016" w:type="dxa"/>
             <w:gridSpan w:val="2"/>
           </w:tcPr>
           <w:p>
             <w:r>
-              <w:t>Test Resource Availability</w:t>
+              <w:t>Build stability</w:t>
             </w:r>
           </w:p>
         </w:tc>
@@ -2953,7 +4151,7 @@
           </w:tcPr>
           <w:p>
             <w:r>
-              <w:t>Test team assigned</w:t>
+              <w:t>Build deployed successfully</w:t>
             </w:r>
           </w:p>
         </w:tc>
@@ -2967,10 +4165,10 @@
                 <w:noProof/>
               </w:rPr>
               <w:drawing>
-                <wp:inline distT="0" distB="0" distL="0" distR="0" wp14:anchorId="605AB1AB" wp14:editId="125ED041">
+                <wp:inline distT="0" distB="0" distL="0" distR="0" wp14:anchorId="2A709CB1" wp14:editId="3D37F896">
                   <wp:extent cx="266131" cy="266131"/>
                   <wp:effectExtent l="0" t="0" r="635" b="635"/>
-                  <wp:docPr id="971842648" name="Graphic 1" descr="Checkmark with solid fill"/>
+                  <wp:docPr id="1005026009" name="Graphic 1" descr="Checkmark with solid fill"/>
                   <wp:cNvGraphicFramePr>
                     <a:graphicFrameLocks xmlns:a="http://schemas.openxmlformats.org/drawingml/2006/main" noChangeAspect="1"/>
                   </wp:cNvGraphicFramePr>
@@ -2982,10 +4180,10 @@
                           <pic:cNvPicPr/>
                         </pic:nvPicPr>
                         <pic:blipFill>
-                          <a:blip r:embed="rId5">
+                          <a:blip r:embed="rId6">
                             <a:extLst>
                               <a:ext uri="{96DAC541-7B7A-43D3-8B79-37D633B846F1}">
-                                <asvg:svgBlip xmlns:asvg="http://schemas.microsoft.com/office/drawing/2016/SVG/main" r:embed="rId6"/>
+                                <asvg:svgBlip xmlns:asvg="http://schemas.microsoft.com/office/drawing/2016/SVG/main" r:embed="rId7"/>
                               </a:ext>
                             </a:extLst>
                           </a:blip>
@@ -3014,6 +4212,84 @@
       <w:tr>
         <w:tc>
           <w:tcPr>
+            <w:tcW w:w="9016" w:type="dxa"/>
+            <w:gridSpan w:val="2"/>
+          </w:tcPr>
+          <w:p>
+            <w:r>
+              <w:t>Test Resource Availability</w:t>
+            </w:r>
+          </w:p>
+        </w:tc>
+      </w:tr>
+      <w:tr>
+        <w:tc>
+          <w:tcPr>
+            <w:tcW w:w="4508" w:type="dxa"/>
+          </w:tcPr>
+          <w:p>
+            <w:r>
+              <w:t>Test team assigned</w:t>
+            </w:r>
+          </w:p>
+        </w:tc>
+        <w:tc>
+          <w:tcPr>
+            <w:tcW w:w="4508" w:type="dxa"/>
+          </w:tcPr>
+          <w:p>
+            <w:r>
+              <w:rPr>
+                <w:noProof/>
+              </w:rPr>
+              <w:drawing>
+                <wp:inline distT="0" distB="0" distL="0" distR="0" wp14:anchorId="605AB1AB" wp14:editId="125ED041">
+                  <wp:extent cx="266131" cy="266131"/>
+                  <wp:effectExtent l="0" t="0" r="635" b="635"/>
+                  <wp:docPr id="971842648" name="Graphic 1" descr="Checkmark with solid fill"/>
+                  <wp:cNvGraphicFramePr>
+                    <a:graphicFrameLocks xmlns:a="http://schemas.openxmlformats.org/drawingml/2006/main" noChangeAspect="1"/>
+                  </wp:cNvGraphicFramePr>
+                  <a:graphic xmlns:a="http://schemas.openxmlformats.org/drawingml/2006/main">
+                    <a:graphicData uri="http://schemas.openxmlformats.org/drawingml/2006/picture">
+                      <pic:pic xmlns:pic="http://schemas.openxmlformats.org/drawingml/2006/picture">
+                        <pic:nvPicPr>
+                          <pic:cNvPr id="842955734" name="Graphic 842955734" descr="Checkmark with solid fill"/>
+                          <pic:cNvPicPr/>
+                        </pic:nvPicPr>
+                        <pic:blipFill>
+                          <a:blip r:embed="rId6">
+                            <a:extLst>
+                              <a:ext uri="{96DAC541-7B7A-43D3-8B79-37D633B846F1}">
+                                <asvg:svgBlip xmlns:asvg="http://schemas.microsoft.com/office/drawing/2016/SVG/main" r:embed="rId7"/>
+                              </a:ext>
+                            </a:extLst>
+                          </a:blip>
+                          <a:stretch>
+                            <a:fillRect/>
+                          </a:stretch>
+                        </pic:blipFill>
+                        <pic:spPr>
+                          <a:xfrm>
+                            <a:off x="0" y="0"/>
+                            <a:ext cx="272427" cy="272427"/>
+                          </a:xfrm>
+                          <a:prstGeom prst="rect">
+                            <a:avLst/>
+                          </a:prstGeom>
+                        </pic:spPr>
+                      </pic:pic>
+                    </a:graphicData>
+                  </a:graphic>
+                </wp:inline>
+              </w:drawing>
+            </w:r>
+          </w:p>
+        </w:tc>
+      </w:tr>
+      <w:tr>
+        <w:tc>
+          <w:tcPr>
             <w:tcW w:w="4508" w:type="dxa"/>
           </w:tcPr>
           <w:p>
@@ -3043,21 +4319,16 @@
     </w:p>
     <w:p>
       <w:pPr>
-        <w:pStyle w:val="ListParagraph"/>
-        <w:ind w:left="1440"/>
-      </w:pPr>
-    </w:p>
-    <w:p>
-      <w:pPr>
-        <w:pStyle w:val="ListParagraph"/>
-        <w:numPr>
-          <w:ilvl w:val="0"/>
-          <w:numId w:val="1"/>
-        </w:numPr>
+        <w:pStyle w:val="Heading1"/>
       </w:pPr>
       <w:r>
         <w:t>Exit Criteria</w:t>
       </w:r>
+    </w:p>
+    <w:p>
+      <w:pPr>
+        <w:pStyle w:val="ListParagraph"/>
+      </w:pPr>
     </w:p>
     <w:p>
       <w:pPr>
@@ -3247,21 +4518,362 @@
     </w:p>
     <w:p>
       <w:pPr>
+        <w:ind w:left="360"/>
+      </w:pPr>
+      <w:r>
+        <w:t>Where the exit criteria have not been met, testing results will be reviewed by the test lead and stakeholders, and risks will be assessed.</w:t>
+      </w:r>
+    </w:p>
+    <w:p>
+      <w:pPr>
+        <w:ind w:left="360"/>
+      </w:pPr>
+      <w:r>
+        <w:t>The test lead</w:t>
+      </w:r>
+      <w:r>
+        <w:t xml:space="preserve"> and </w:t>
+      </w:r>
+      <w:r>
+        <w:t>the stakeholders make the final call regarding the release of the university portal.</w:t>
+      </w:r>
+    </w:p>
+    <w:p>
+      <w:pPr>
+        <w:ind w:left="360"/>
+      </w:pPr>
+      <w:r>
+        <w:t>All accepted risks are to be recorded.</w:t>
+      </w:r>
+    </w:p>
+    <w:p>
+      <w:pPr>
+        <w:pStyle w:val="Heading1"/>
+      </w:pPr>
+      <w:r>
+        <w:t>Roles and Responsibilities</w:t>
+      </w:r>
+    </w:p>
+    <w:p>
+      <w:pPr>
+        <w:pStyle w:val="ListParagraph"/>
+      </w:pPr>
+    </w:p>
+    <w:tbl>
+      <w:tblPr>
+        <w:tblStyle w:val="TableGrid"/>
+        <w:tblW w:w="0" w:type="auto"/>
+        <w:tblInd w:w="720" w:type="dxa"/>
+        <w:tblLook w:val="04A0" w:firstRow="1" w:lastRow="0" w:firstColumn="1" w:lastColumn="0" w:noHBand="0" w:noVBand="1"/>
+      </w:tblPr>
+      <w:tblGrid>
+        <w:gridCol w:w="3670"/>
+        <w:gridCol w:w="4626"/>
+      </w:tblGrid>
+      <w:tr>
+        <w:tc>
+          <w:tcPr>
+            <w:tcW w:w="3670" w:type="dxa"/>
+          </w:tcPr>
+          <w:p>
+            <w:pPr>
+              <w:pStyle w:val="ListParagraph"/>
+              <w:ind w:left="0"/>
+            </w:pPr>
+            <w:r>
+              <w:t>Role</w:t>
+            </w:r>
+          </w:p>
+        </w:tc>
+        <w:tc>
+          <w:tcPr>
+            <w:tcW w:w="4626" w:type="dxa"/>
+          </w:tcPr>
+          <w:p>
+            <w:pPr>
+              <w:pStyle w:val="ListParagraph"/>
+              <w:ind w:left="0"/>
+            </w:pPr>
+            <w:r>
+              <w:t>Responsibilities</w:t>
+            </w:r>
+          </w:p>
+        </w:tc>
+      </w:tr>
+      <w:tr>
+        <w:tc>
+          <w:tcPr>
+            <w:tcW w:w="3670" w:type="dxa"/>
+          </w:tcPr>
+          <w:p>
+            <w:pPr>
+              <w:pStyle w:val="ListParagraph"/>
+              <w:ind w:left="0"/>
+            </w:pPr>
+            <w:r>
+              <w:t>Test lead</w:t>
+            </w:r>
+          </w:p>
+        </w:tc>
+        <w:tc>
+          <w:tcPr>
+            <w:tcW w:w="4626" w:type="dxa"/>
+          </w:tcPr>
+          <w:p>
+            <w:pPr>
+              <w:pStyle w:val="ListParagraph"/>
+              <w:ind w:left="0"/>
+            </w:pPr>
+            <w:r>
+              <w:t xml:space="preserve">Liaise with stakeholders and the rest of the testing </w:t>
+            </w:r>
+            <w:r>
+              <w:t>team and</w:t>
+            </w:r>
+            <w:r>
+              <w:t xml:space="preserve"> be a medium of communication between the two</w:t>
+            </w:r>
+            <w:r>
+              <w:t>.</w:t>
+            </w:r>
+          </w:p>
+        </w:tc>
+      </w:tr>
+      <w:tr>
+        <w:tc>
+          <w:tcPr>
+            <w:tcW w:w="3670" w:type="dxa"/>
+          </w:tcPr>
+          <w:p>
+            <w:pPr>
+              <w:pStyle w:val="ListParagraph"/>
+              <w:ind w:left="0"/>
+            </w:pPr>
+            <w:r>
+              <w:t xml:space="preserve">Manual </w:t>
+            </w:r>
+            <w:r>
+              <w:t>Test</w:t>
+            </w:r>
+            <w:r>
+              <w:t>ing Team</w:t>
+            </w:r>
+          </w:p>
+        </w:tc>
+        <w:tc>
+          <w:tcPr>
+            <w:tcW w:w="4626" w:type="dxa"/>
+          </w:tcPr>
+          <w:p>
+            <w:pPr>
+              <w:pStyle w:val="ListParagraph"/>
+              <w:ind w:left="0"/>
+            </w:pPr>
+            <w:r>
+              <w:t>Test execution.</w:t>
+            </w:r>
+          </w:p>
+        </w:tc>
+      </w:tr>
+      <w:tr>
+        <w:tc>
+          <w:tcPr>
+            <w:tcW w:w="3670" w:type="dxa"/>
+          </w:tcPr>
+          <w:p>
+            <w:pPr>
+              <w:pStyle w:val="ListParagraph"/>
+              <w:ind w:left="0"/>
+            </w:pPr>
+            <w:r>
+              <w:t>Test Analyst</w:t>
+            </w:r>
+          </w:p>
+        </w:tc>
+        <w:tc>
+          <w:tcPr>
+            <w:tcW w:w="4626" w:type="dxa"/>
+          </w:tcPr>
+          <w:p>
+            <w:pPr>
+              <w:pStyle w:val="ListParagraph"/>
+              <w:ind w:left="0"/>
+            </w:pPr>
+            <w:r>
+              <w:t xml:space="preserve">Test analysis, test design, </w:t>
+            </w:r>
+            <w:r>
+              <w:t xml:space="preserve">and </w:t>
+            </w:r>
+            <w:r>
+              <w:t>test implementation</w:t>
+            </w:r>
+            <w:r>
+              <w:t>.</w:t>
+            </w:r>
+          </w:p>
+        </w:tc>
+      </w:tr>
+      <w:tr>
+        <w:tc>
+          <w:tcPr>
+            <w:tcW w:w="3670" w:type="dxa"/>
+          </w:tcPr>
+          <w:p>
+            <w:pPr>
+              <w:pStyle w:val="ListParagraph"/>
+              <w:ind w:left="0"/>
+            </w:pPr>
+            <w:r>
+              <w:t>Automation Testing Team</w:t>
+            </w:r>
+          </w:p>
+        </w:tc>
+        <w:tc>
+          <w:tcPr>
+            <w:tcW w:w="4626" w:type="dxa"/>
+          </w:tcPr>
+          <w:p>
+            <w:pPr>
+              <w:pStyle w:val="ListParagraph"/>
+              <w:ind w:left="0"/>
+            </w:pPr>
+            <w:r>
+              <w:t>Automating test cases from the regression test suite and writing automation test scripts</w:t>
+            </w:r>
+            <w:r>
+              <w:t>.</w:t>
+            </w:r>
+          </w:p>
+        </w:tc>
+      </w:tr>
+    </w:tbl>
+    <w:p>
+      <w:pPr>
+        <w:rPr>
+          <w:u w:val="single"/>
+        </w:rPr>
+      </w:pPr>
+    </w:p>
+    <w:p>
+      <w:pPr>
+        <w:pStyle w:val="Heading1"/>
+      </w:pPr>
+      <w:r>
+        <w:t>Test Deliverables</w:t>
+      </w:r>
+    </w:p>
+    <w:p>
+      <w:pPr>
+        <w:pStyle w:val="ListParagraph"/>
+      </w:pPr>
+    </w:p>
+    <w:p>
+      <w:pPr>
+        <w:pStyle w:val="ListParagraph"/>
+        <w:rPr>
+          <w:i/>
+          <w:iCs/>
+        </w:rPr>
+      </w:pPr>
+      <w:r>
+        <w:rPr>
+          <w:i/>
+          <w:iCs/>
+        </w:rPr>
+        <w:t>The following test documentation will be produced:</w:t>
+      </w:r>
+    </w:p>
+    <w:p>
+      <w:pPr>
+        <w:pStyle w:val="ListParagraph"/>
+      </w:pPr>
+      <w:r>
+        <w:t>Manual Testing</w:t>
+      </w:r>
+    </w:p>
+    <w:p>
+      <w:pPr>
         <w:pStyle w:val="ListParagraph"/>
         <w:numPr>
           <w:ilvl w:val="0"/>
-          <w:numId w:val="1"/>
+          <w:numId w:val="18"/>
         </w:numPr>
       </w:pPr>
       <w:r>
-        <w:t xml:space="preserve">Review with stakeholders </w:t>
-      </w:r>
-    </w:p>
-    <w:p>
-      <w:pPr>
-        <w:pStyle w:val="ListParagraph"/>
-        <w:ind w:left="2160"/>
-      </w:pPr>
+        <w:t>Test strategy</w:t>
+      </w:r>
+      <w:r>
+        <w:t xml:space="preserve"> – Before testing commences</w:t>
+      </w:r>
+    </w:p>
+    <w:p>
+      <w:pPr>
+        <w:pStyle w:val="ListParagraph"/>
+        <w:numPr>
+          <w:ilvl w:val="0"/>
+          <w:numId w:val="18"/>
+        </w:numPr>
+      </w:pPr>
+      <w:r>
+        <w:t>Test cases</w:t>
+      </w:r>
+      <w:r>
+        <w:t xml:space="preserve"> – During testing</w:t>
+      </w:r>
+    </w:p>
+    <w:p>
+      <w:pPr>
+        <w:pStyle w:val="ListParagraph"/>
+        <w:numPr>
+          <w:ilvl w:val="0"/>
+          <w:numId w:val="18"/>
+        </w:numPr>
+      </w:pPr>
+      <w:r>
+        <w:t>Bug logs</w:t>
+      </w:r>
+      <w:r>
+        <w:t xml:space="preserve"> – During testing</w:t>
+      </w:r>
+    </w:p>
+    <w:p>
+      <w:pPr>
+        <w:pStyle w:val="ListParagraph"/>
+        <w:numPr>
+          <w:ilvl w:val="0"/>
+          <w:numId w:val="18"/>
+        </w:numPr>
+      </w:pPr>
+      <w:r>
+        <w:t>Result reports</w:t>
+      </w:r>
+      <w:r>
+        <w:t xml:space="preserve"> – Post testing</w:t>
+      </w:r>
+    </w:p>
+    <w:p>
+      <w:pPr>
+        <w:ind w:left="720"/>
+      </w:pPr>
+      <w:r>
+        <w:t>Automation Testing</w:t>
+      </w:r>
+    </w:p>
+    <w:p>
+      <w:pPr>
+        <w:pStyle w:val="ListParagraph"/>
+        <w:numPr>
+          <w:ilvl w:val="0"/>
+          <w:numId w:val="20"/>
+        </w:numPr>
+      </w:pPr>
+      <w:r>
+        <w:t>Automation scripts</w:t>
+      </w:r>
+      <w:r>
+        <w:t xml:space="preserve"> – During testing</w:t>
+      </w:r>
     </w:p>
     <w:p>
       <w:pPr>
@@ -3271,24 +4883,420 @@
     </w:p>
     <w:p>
       <w:pPr>
-        <w:pStyle w:val="ListParagraph"/>
-      </w:pPr>
-    </w:p>
-    <w:p>
-      <w:pPr>
-        <w:pStyle w:val="ListParagraph"/>
-      </w:pPr>
-    </w:p>
-    <w:p>
-      <w:pPr>
-        <w:pStyle w:val="ListParagraph"/>
-      </w:pPr>
-    </w:p>
+        <w:pStyle w:val="Heading1"/>
+      </w:pPr>
+      <w:r>
+        <w:t xml:space="preserve"> </w:t>
+      </w:r>
+      <w:r>
+        <w:t>Communication Plan</w:t>
+      </w:r>
+    </w:p>
+    <w:p>
+      <w:pPr>
+        <w:pStyle w:val="ListParagraph"/>
+      </w:pPr>
+    </w:p>
+    <w:p>
+      <w:pPr>
+        <w:pStyle w:val="ListParagraph"/>
+      </w:pPr>
+      <w:r>
+        <w:t xml:space="preserve">Communication between the testing team and the test lead will occur via Microsoft Teams. </w:t>
+      </w:r>
+      <w:r>
+        <w:t>All members who are a part of the testing team assigned to this project will be added to a group titled – USP (Quality Control) on Microsoft Teams, and this is where all communication associated with this project will occur.</w:t>
+      </w:r>
+    </w:p>
+    <w:p>
+      <w:pPr>
+        <w:pStyle w:val="ListParagraph"/>
+      </w:pPr>
+      <w:r>
+        <w:t xml:space="preserve">Progress of testing will be tracked using Jira. All members will be added to a project titled -  USP (Quality Control) – on Jira. This is where </w:t>
+      </w:r>
+      <w:r>
+        <w:t xml:space="preserve">detailed </w:t>
+      </w:r>
+      <w:r>
+        <w:t>role assignment will be done.</w:t>
+      </w:r>
+    </w:p>
+    <w:p>
+      <w:pPr>
+        <w:pStyle w:val="ListParagraph"/>
+      </w:pPr>
+      <w:r>
+        <w:t xml:space="preserve">The test lead and stakeholders will </w:t>
+      </w:r>
+      <w:r>
+        <w:t xml:space="preserve">communicate via </w:t>
+      </w:r>
+      <w:r>
+        <w:t xml:space="preserve">the established </w:t>
+      </w:r>
+      <w:r>
+        <w:t>communication channels</w:t>
+      </w:r>
+      <w:r>
+        <w:t>,</w:t>
+      </w:r>
+      <w:r>
+        <w:t xml:space="preserve"> as they will have access to</w:t>
+      </w:r>
+      <w:r>
+        <w:t xml:space="preserve"> all communication channels.</w:t>
+      </w:r>
+    </w:p>
+    <w:p/>
+    <w:p/>
+    <w:p/>
+    <w:p/>
+    <w:p/>
+    <w:p/>
+    <w:p/>
+    <w:p/>
+    <w:p/>
+    <w:p/>
+    <w:p/>
+    <w:p/>
+    <w:p/>
+    <w:p/>
+    <w:p/>
+    <w:p/>
+    <w:p>
+      <w:pPr>
+        <w:pStyle w:val="Heading1"/>
+      </w:pPr>
+      <w:r>
+        <w:t>Feedback from Test Lead and Stakeholders:</w:t>
+      </w:r>
+    </w:p>
+    <w:tbl>
+      <w:tblPr>
+        <w:tblStyle w:val="TableGrid"/>
+        <w:tblW w:w="0" w:type="auto"/>
+        <w:tblBorders>
+          <w:top w:val="none" w:sz="0" w:space="0" w:color="auto"/>
+          <w:left w:val="none" w:sz="0" w:space="0" w:color="auto"/>
+          <w:right w:val="none" w:sz="0" w:space="0" w:color="auto"/>
+          <w:insideV w:val="none" w:sz="0" w:space="0" w:color="auto"/>
+        </w:tblBorders>
+        <w:tblLook w:val="04A0" w:firstRow="1" w:lastRow="0" w:firstColumn="1" w:lastColumn="0" w:noHBand="0" w:noVBand="1"/>
+      </w:tblPr>
+      <w:tblGrid>
+        <w:gridCol w:w="4508"/>
+        <w:gridCol w:w="4508"/>
+      </w:tblGrid>
+      <w:tr>
+        <w:tc>
+          <w:tcPr>
+            <w:tcW w:w="4508" w:type="dxa"/>
+          </w:tcPr>
+          <w:p/>
+        </w:tc>
+        <w:tc>
+          <w:tcPr>
+            <w:tcW w:w="4508" w:type="dxa"/>
+          </w:tcPr>
+          <w:p/>
+        </w:tc>
+      </w:tr>
+      <w:tr>
+        <w:tc>
+          <w:tcPr>
+            <w:tcW w:w="4508" w:type="dxa"/>
+          </w:tcPr>
+          <w:p/>
+        </w:tc>
+        <w:tc>
+          <w:tcPr>
+            <w:tcW w:w="4508" w:type="dxa"/>
+          </w:tcPr>
+          <w:p/>
+        </w:tc>
+      </w:tr>
+      <w:tr>
+        <w:tc>
+          <w:tcPr>
+            <w:tcW w:w="4508" w:type="dxa"/>
+          </w:tcPr>
+          <w:p/>
+        </w:tc>
+        <w:tc>
+          <w:tcPr>
+            <w:tcW w:w="4508" w:type="dxa"/>
+          </w:tcPr>
+          <w:p/>
+        </w:tc>
+      </w:tr>
+      <w:tr>
+        <w:tc>
+          <w:tcPr>
+            <w:tcW w:w="4508" w:type="dxa"/>
+          </w:tcPr>
+          <w:p/>
+        </w:tc>
+        <w:tc>
+          <w:tcPr>
+            <w:tcW w:w="4508" w:type="dxa"/>
+          </w:tcPr>
+          <w:p/>
+        </w:tc>
+      </w:tr>
+      <w:tr>
+        <w:tc>
+          <w:tcPr>
+            <w:tcW w:w="4508" w:type="dxa"/>
+          </w:tcPr>
+          <w:p/>
+        </w:tc>
+        <w:tc>
+          <w:tcPr>
+            <w:tcW w:w="4508" w:type="dxa"/>
+          </w:tcPr>
+          <w:p/>
+        </w:tc>
+      </w:tr>
+      <w:tr>
+        <w:tc>
+          <w:tcPr>
+            <w:tcW w:w="4508" w:type="dxa"/>
+          </w:tcPr>
+          <w:p/>
+        </w:tc>
+        <w:tc>
+          <w:tcPr>
+            <w:tcW w:w="4508" w:type="dxa"/>
+          </w:tcPr>
+          <w:p/>
+        </w:tc>
+      </w:tr>
+      <w:tr>
+        <w:tc>
+          <w:tcPr>
+            <w:tcW w:w="4508" w:type="dxa"/>
+          </w:tcPr>
+          <w:p/>
+        </w:tc>
+        <w:tc>
+          <w:tcPr>
+            <w:tcW w:w="4508" w:type="dxa"/>
+          </w:tcPr>
+          <w:p/>
+        </w:tc>
+      </w:tr>
+      <w:tr>
+        <w:tc>
+          <w:tcPr>
+            <w:tcW w:w="4508" w:type="dxa"/>
+          </w:tcPr>
+          <w:p/>
+        </w:tc>
+        <w:tc>
+          <w:tcPr>
+            <w:tcW w:w="4508" w:type="dxa"/>
+          </w:tcPr>
+          <w:p/>
+        </w:tc>
+      </w:tr>
+      <w:tr>
+        <w:tc>
+          <w:tcPr>
+            <w:tcW w:w="4508" w:type="dxa"/>
+          </w:tcPr>
+          <w:p/>
+        </w:tc>
+        <w:tc>
+          <w:tcPr>
+            <w:tcW w:w="4508" w:type="dxa"/>
+          </w:tcPr>
+          <w:p/>
+        </w:tc>
+      </w:tr>
+      <w:tr>
+        <w:tc>
+          <w:tcPr>
+            <w:tcW w:w="4508" w:type="dxa"/>
+          </w:tcPr>
+          <w:p/>
+        </w:tc>
+        <w:tc>
+          <w:tcPr>
+            <w:tcW w:w="4508" w:type="dxa"/>
+          </w:tcPr>
+          <w:p/>
+        </w:tc>
+      </w:tr>
+      <w:tr>
+        <w:tc>
+          <w:tcPr>
+            <w:tcW w:w="4508" w:type="dxa"/>
+          </w:tcPr>
+          <w:p/>
+        </w:tc>
+        <w:tc>
+          <w:tcPr>
+            <w:tcW w:w="4508" w:type="dxa"/>
+          </w:tcPr>
+          <w:p/>
+        </w:tc>
+      </w:tr>
+      <w:tr>
+        <w:tc>
+          <w:tcPr>
+            <w:tcW w:w="4508" w:type="dxa"/>
+          </w:tcPr>
+          <w:p/>
+        </w:tc>
+        <w:tc>
+          <w:tcPr>
+            <w:tcW w:w="4508" w:type="dxa"/>
+          </w:tcPr>
+          <w:p/>
+        </w:tc>
+      </w:tr>
+    </w:tbl>
+    <w:p/>
+    <w:p>
+      <w:pPr>
+        <w:pStyle w:val="Heading1"/>
+      </w:pPr>
+      <w:r>
+        <w:t>Approval</w:t>
+      </w:r>
+      <w:r>
+        <w:t xml:space="preserve"> (</w:t>
+      </w:r>
+      <w:r>
+        <w:rPr>
+          <w:i/>
+          <w:iCs/>
+        </w:rPr>
+        <w:t>please sign</w:t>
+      </w:r>
+      <w:r>
+        <w:t>)</w:t>
+      </w:r>
+      <w:r>
+        <w:t>:</w:t>
+      </w:r>
+    </w:p>
+    <w:tbl>
+      <w:tblPr>
+        <w:tblStyle w:val="TableGrid"/>
+        <w:tblW w:w="0" w:type="auto"/>
+        <w:tblLook w:val="04A0" w:firstRow="1" w:lastRow="0" w:firstColumn="1" w:lastColumn="0" w:noHBand="0" w:noVBand="1"/>
+      </w:tblPr>
+      <w:tblGrid>
+        <w:gridCol w:w="2254"/>
+        <w:gridCol w:w="2254"/>
+        <w:gridCol w:w="2254"/>
+        <w:gridCol w:w="2254"/>
+      </w:tblGrid>
+      <w:tr>
+        <w:tc>
+          <w:tcPr>
+            <w:tcW w:w="2254" w:type="dxa"/>
+          </w:tcPr>
+          <w:p>
+            <w:r>
+              <w:t>Test Lead:</w:t>
+            </w:r>
+          </w:p>
+        </w:tc>
+        <w:tc>
+          <w:tcPr>
+            <w:tcW w:w="2254" w:type="dxa"/>
+          </w:tcPr>
+          <w:p>
+            <w:pPr>
+              <w:rPr>
+                <w:u w:val="single"/>
+              </w:rPr>
+            </w:pPr>
+          </w:p>
+        </w:tc>
+        <w:tc>
+          <w:tcPr>
+            <w:tcW w:w="2254" w:type="dxa"/>
+          </w:tcPr>
+          <w:p>
+            <w:r>
+              <w:t>Stakeholder:</w:t>
+            </w:r>
+          </w:p>
+        </w:tc>
+        <w:tc>
+          <w:tcPr>
+            <w:tcW w:w="2254" w:type="dxa"/>
+          </w:tcPr>
+          <w:p>
+            <w:pPr>
+              <w:rPr>
+                <w:u w:val="single"/>
+              </w:rPr>
+            </w:pPr>
+          </w:p>
+        </w:tc>
+      </w:tr>
+      <w:tr>
+        <w:tc>
+          <w:tcPr>
+            <w:tcW w:w="2254" w:type="dxa"/>
+          </w:tcPr>
+          <w:p>
+            <w:r>
+              <w:t>Date</w:t>
+            </w:r>
+            <w:r>
+              <w:t>:</w:t>
+            </w:r>
+          </w:p>
+        </w:tc>
+        <w:tc>
+          <w:tcPr>
+            <w:tcW w:w="2254" w:type="dxa"/>
+          </w:tcPr>
+          <w:p>
+            <w:pPr>
+              <w:rPr>
+                <w:u w:val="single"/>
+              </w:rPr>
+            </w:pPr>
+          </w:p>
+        </w:tc>
+        <w:tc>
+          <w:tcPr>
+            <w:tcW w:w="2254" w:type="dxa"/>
+          </w:tcPr>
+          <w:p>
+            <w:r>
+              <w:t>Date:</w:t>
+            </w:r>
+          </w:p>
+        </w:tc>
+        <w:tc>
+          <w:tcPr>
+            <w:tcW w:w="2254" w:type="dxa"/>
+          </w:tcPr>
+          <w:p>
+            <w:pPr>
+              <w:rPr>
+                <w:u w:val="single"/>
+              </w:rPr>
+            </w:pPr>
+          </w:p>
+        </w:tc>
+      </w:tr>
+    </w:tbl>
     <w:p/>
     <w:sectPr>
       <w:pgSz w:w="11906" w:h="16838"/>
       <w:pgMar w:top="1440" w:right="1440" w:bottom="1440" w:left="1440" w:header="708" w:footer="708" w:gutter="0"/>
+      <w:pgNumType w:start="0"/>
       <w:cols w:space="708"/>
+      <w:titlePg/>
       <w:docGrid w:linePitch="360"/>
     </w:sectPr>
   </w:body>
@@ -3592,6 +5600,119 @@
     </w:lvl>
   </w:abstractNum>
   <w:abstractNum w:abstractNumId="2" w15:restartNumberingAfterBreak="0">
+    <w:nsid w:val="0D6C08F0"/>
+    <w:multiLevelType w:val="hybridMultilevel"/>
+    <w:tmpl w:val="42CC1580"/>
+    <w:lvl w:ilvl="0" w:tplc="1C090003">
+      <w:start w:val="1"/>
+      <w:numFmt w:val="bullet"/>
+      <w:lvlText w:val="o"/>
+      <w:lvlJc w:val="left"/>
+      <w:pPr>
+        <w:ind w:left="720" w:hanging="360"/>
+      </w:pPr>
+      <w:rPr>
+        <w:rFonts w:ascii="Courier New" w:hAnsi="Courier New" w:cs="Courier New" w:hint="default"/>
+      </w:rPr>
+    </w:lvl>
+    <w:lvl w:ilvl="1" w:tplc="1C090003">
+      <w:start w:val="1"/>
+      <w:numFmt w:val="bullet"/>
+      <w:lvlText w:val="o"/>
+      <w:lvlJc w:val="left"/>
+      <w:pPr>
+        <w:ind w:left="1440" w:hanging="360"/>
+      </w:pPr>
+      <w:rPr>
+        <w:rFonts w:ascii="Courier New" w:hAnsi="Courier New" w:cs="Courier New" w:hint="default"/>
+      </w:rPr>
+    </w:lvl>
+    <w:lvl w:ilvl="2" w:tplc="1C090005" w:tentative="1">
+      <w:start w:val="1"/>
+      <w:numFmt w:val="bullet"/>
+      <w:lvlText w:val=""/>
+      <w:lvlJc w:val="left"/>
+      <w:pPr>
+        <w:ind w:left="2160" w:hanging="360"/>
+      </w:pPr>
+      <w:rPr>
+        <w:rFonts w:ascii="Wingdings" w:hAnsi="Wingdings" w:hint="default"/>
+      </w:rPr>
+    </w:lvl>
+    <w:lvl w:ilvl="3" w:tplc="1C090001" w:tentative="1">
+      <w:start w:val="1"/>
+      <w:numFmt w:val="bullet"/>
+      <w:lvlText w:val=""/>
+      <w:lvlJc w:val="left"/>
+      <w:pPr>
+        <w:ind w:left="2880" w:hanging="360"/>
+      </w:pPr>
+      <w:rPr>
+        <w:rFonts w:ascii="Symbol" w:hAnsi="Symbol" w:hint="default"/>
+      </w:rPr>
+    </w:lvl>
+    <w:lvl w:ilvl="4" w:tplc="1C090003" w:tentative="1">
+      <w:start w:val="1"/>
+      <w:numFmt w:val="bullet"/>
+      <w:lvlText w:val="o"/>
+      <w:lvlJc w:val="left"/>
+      <w:pPr>
+        <w:ind w:left="3600" w:hanging="360"/>
+      </w:pPr>
+      <w:rPr>
+        <w:rFonts w:ascii="Courier New" w:hAnsi="Courier New" w:cs="Courier New" w:hint="default"/>
+      </w:rPr>
+    </w:lvl>
+    <w:lvl w:ilvl="5" w:tplc="1C090005" w:tentative="1">
+      <w:start w:val="1"/>
+      <w:numFmt w:val="bullet"/>
+      <w:lvlText w:val=""/>
+      <w:lvlJc w:val="left"/>
+      <w:pPr>
+        <w:ind w:left="4320" w:hanging="360"/>
+      </w:pPr>
+      <w:rPr>
+        <w:rFonts w:ascii="Wingdings" w:hAnsi="Wingdings" w:hint="default"/>
+      </w:rPr>
+    </w:lvl>
+    <w:lvl w:ilvl="6" w:tplc="1C090001" w:tentative="1">
+      <w:start w:val="1"/>
+      <w:numFmt w:val="bullet"/>
+      <w:lvlText w:val=""/>
+      <w:lvlJc w:val="left"/>
+      <w:pPr>
+        <w:ind w:left="5040" w:hanging="360"/>
+      </w:pPr>
+      <w:rPr>
+        <w:rFonts w:ascii="Symbol" w:hAnsi="Symbol" w:hint="default"/>
+      </w:rPr>
+    </w:lvl>
+    <w:lvl w:ilvl="7" w:tplc="1C090003" w:tentative="1">
+      <w:start w:val="1"/>
+      <w:numFmt w:val="bullet"/>
+      <w:lvlText w:val="o"/>
+      <w:lvlJc w:val="left"/>
+      <w:pPr>
+        <w:ind w:left="5760" w:hanging="360"/>
+      </w:pPr>
+      <w:rPr>
+        <w:rFonts w:ascii="Courier New" w:hAnsi="Courier New" w:cs="Courier New" w:hint="default"/>
+      </w:rPr>
+    </w:lvl>
+    <w:lvl w:ilvl="8" w:tplc="1C090005" w:tentative="1">
+      <w:start w:val="1"/>
+      <w:numFmt w:val="bullet"/>
+      <w:lvlText w:val=""/>
+      <w:lvlJc w:val="left"/>
+      <w:pPr>
+        <w:ind w:left="6480" w:hanging="360"/>
+      </w:pPr>
+      <w:rPr>
+        <w:rFonts w:ascii="Wingdings" w:hAnsi="Wingdings" w:hint="default"/>
+      </w:rPr>
+    </w:lvl>
+  </w:abstractNum>
+  <w:abstractNum w:abstractNumId="3" w15:restartNumberingAfterBreak="0">
     <w:nsid w:val="18925BF3"/>
     <w:multiLevelType w:val="multilevel"/>
     <w:tmpl w:val="276EFC8A"/>
@@ -3736,7 +5857,7 @@
       </w:rPr>
     </w:lvl>
   </w:abstractNum>
-  <w:abstractNum w:abstractNumId="3" w15:restartNumberingAfterBreak="0">
+  <w:abstractNum w:abstractNumId="4" w15:restartNumberingAfterBreak="0">
     <w:nsid w:val="255262FC"/>
     <w:multiLevelType w:val="multilevel"/>
     <w:tmpl w:val="D6A05FE4"/>
@@ -3885,10 +6006,10 @@
       </w:rPr>
     </w:lvl>
   </w:abstractNum>
-  <w:abstractNum w:abstractNumId="4" w15:restartNumberingAfterBreak="0">
+  <w:abstractNum w:abstractNumId="5" w15:restartNumberingAfterBreak="0">
     <w:nsid w:val="2E261111"/>
     <w:multiLevelType w:val="hybridMultilevel"/>
-    <w:tmpl w:val="B090F94A"/>
+    <w:tmpl w:val="384AC0A2"/>
     <w:lvl w:ilvl="0" w:tplc="1C090001">
       <w:start w:val="1"/>
       <w:numFmt w:val="bullet"/>
@@ -3998,7 +6119,233 @@
       </w:rPr>
     </w:lvl>
   </w:abstractNum>
-  <w:abstractNum w:abstractNumId="5" w15:restartNumberingAfterBreak="0">
+  <w:abstractNum w:abstractNumId="6" w15:restartNumberingAfterBreak="0">
+    <w:nsid w:val="3B154A83"/>
+    <w:multiLevelType w:val="hybridMultilevel"/>
+    <w:tmpl w:val="8C24B88A"/>
+    <w:lvl w:ilvl="0" w:tplc="1C090001">
+      <w:start w:val="1"/>
+      <w:numFmt w:val="bullet"/>
+      <w:lvlText w:val=""/>
+      <w:lvlJc w:val="left"/>
+      <w:pPr>
+        <w:ind w:left="1440" w:hanging="360"/>
+      </w:pPr>
+      <w:rPr>
+        <w:rFonts w:ascii="Symbol" w:hAnsi="Symbol" w:hint="default"/>
+      </w:rPr>
+    </w:lvl>
+    <w:lvl w:ilvl="1" w:tplc="1C090003" w:tentative="1">
+      <w:start w:val="1"/>
+      <w:numFmt w:val="bullet"/>
+      <w:lvlText w:val="o"/>
+      <w:lvlJc w:val="left"/>
+      <w:pPr>
+        <w:ind w:left="2160" w:hanging="360"/>
+      </w:pPr>
+      <w:rPr>
+        <w:rFonts w:ascii="Courier New" w:hAnsi="Courier New" w:cs="Courier New" w:hint="default"/>
+      </w:rPr>
+    </w:lvl>
+    <w:lvl w:ilvl="2" w:tplc="1C090005" w:tentative="1">
+      <w:start w:val="1"/>
+      <w:numFmt w:val="bullet"/>
+      <w:lvlText w:val=""/>
+      <w:lvlJc w:val="left"/>
+      <w:pPr>
+        <w:ind w:left="2880" w:hanging="360"/>
+      </w:pPr>
+      <w:rPr>
+        <w:rFonts w:ascii="Wingdings" w:hAnsi="Wingdings" w:hint="default"/>
+      </w:rPr>
+    </w:lvl>
+    <w:lvl w:ilvl="3" w:tplc="1C090001" w:tentative="1">
+      <w:start w:val="1"/>
+      <w:numFmt w:val="bullet"/>
+      <w:lvlText w:val=""/>
+      <w:lvlJc w:val="left"/>
+      <w:pPr>
+        <w:ind w:left="3600" w:hanging="360"/>
+      </w:pPr>
+      <w:rPr>
+        <w:rFonts w:ascii="Symbol" w:hAnsi="Symbol" w:hint="default"/>
+      </w:rPr>
+    </w:lvl>
+    <w:lvl w:ilvl="4" w:tplc="1C090003" w:tentative="1">
+      <w:start w:val="1"/>
+      <w:numFmt w:val="bullet"/>
+      <w:lvlText w:val="o"/>
+      <w:lvlJc w:val="left"/>
+      <w:pPr>
+        <w:ind w:left="4320" w:hanging="360"/>
+      </w:pPr>
+      <w:rPr>
+        <w:rFonts w:ascii="Courier New" w:hAnsi="Courier New" w:cs="Courier New" w:hint="default"/>
+      </w:rPr>
+    </w:lvl>
+    <w:lvl w:ilvl="5" w:tplc="1C090005" w:tentative="1">
+      <w:start w:val="1"/>
+      <w:numFmt w:val="bullet"/>
+      <w:lvlText w:val=""/>
+      <w:lvlJc w:val="left"/>
+      <w:pPr>
+        <w:ind w:left="5040" w:hanging="360"/>
+      </w:pPr>
+      <w:rPr>
+        <w:rFonts w:ascii="Wingdings" w:hAnsi="Wingdings" w:hint="default"/>
+      </w:rPr>
+    </w:lvl>
+    <w:lvl w:ilvl="6" w:tplc="1C090001" w:tentative="1">
+      <w:start w:val="1"/>
+      <w:numFmt w:val="bullet"/>
+      <w:lvlText w:val=""/>
+      <w:lvlJc w:val="left"/>
+      <w:pPr>
+        <w:ind w:left="5760" w:hanging="360"/>
+      </w:pPr>
+      <w:rPr>
+        <w:rFonts w:ascii="Symbol" w:hAnsi="Symbol" w:hint="default"/>
+      </w:rPr>
+    </w:lvl>
+    <w:lvl w:ilvl="7" w:tplc="1C090003" w:tentative="1">
+      <w:start w:val="1"/>
+      <w:numFmt w:val="bullet"/>
+      <w:lvlText w:val="o"/>
+      <w:lvlJc w:val="left"/>
+      <w:pPr>
+        <w:ind w:left="6480" w:hanging="360"/>
+      </w:pPr>
+      <w:rPr>
+        <w:rFonts w:ascii="Courier New" w:hAnsi="Courier New" w:cs="Courier New" w:hint="default"/>
+      </w:rPr>
+    </w:lvl>
+    <w:lvl w:ilvl="8" w:tplc="1C090005" w:tentative="1">
+      <w:start w:val="1"/>
+      <w:numFmt w:val="bullet"/>
+      <w:lvlText w:val=""/>
+      <w:lvlJc w:val="left"/>
+      <w:pPr>
+        <w:ind w:left="7200" w:hanging="360"/>
+      </w:pPr>
+      <w:rPr>
+        <w:rFonts w:ascii="Wingdings" w:hAnsi="Wingdings" w:hint="default"/>
+      </w:rPr>
+    </w:lvl>
+  </w:abstractNum>
+  <w:abstractNum w:abstractNumId="7" w15:restartNumberingAfterBreak="0">
+    <w:nsid w:val="3DDF60B1"/>
+    <w:multiLevelType w:val="hybridMultilevel"/>
+    <w:tmpl w:val="84B47D16"/>
+    <w:lvl w:ilvl="0" w:tplc="1C090001">
+      <w:start w:val="1"/>
+      <w:numFmt w:val="bullet"/>
+      <w:lvlText w:val=""/>
+      <w:lvlJc w:val="left"/>
+      <w:pPr>
+        <w:ind w:left="1800" w:hanging="360"/>
+      </w:pPr>
+      <w:rPr>
+        <w:rFonts w:ascii="Symbol" w:hAnsi="Symbol" w:hint="default"/>
+      </w:rPr>
+    </w:lvl>
+    <w:lvl w:ilvl="1" w:tplc="1C090003" w:tentative="1">
+      <w:start w:val="1"/>
+      <w:numFmt w:val="bullet"/>
+      <w:lvlText w:val="o"/>
+      <w:lvlJc w:val="left"/>
+      <w:pPr>
+        <w:ind w:left="2520" w:hanging="360"/>
+      </w:pPr>
+      <w:rPr>
+        <w:rFonts w:ascii="Courier New" w:hAnsi="Courier New" w:cs="Courier New" w:hint="default"/>
+      </w:rPr>
+    </w:lvl>
+    <w:lvl w:ilvl="2" w:tplc="1C090005" w:tentative="1">
+      <w:start w:val="1"/>
+      <w:numFmt w:val="bullet"/>
+      <w:lvlText w:val=""/>
+      <w:lvlJc w:val="left"/>
+      <w:pPr>
+        <w:ind w:left="3240" w:hanging="360"/>
+      </w:pPr>
+      <w:rPr>
+        <w:rFonts w:ascii="Wingdings" w:hAnsi="Wingdings" w:hint="default"/>
+      </w:rPr>
+    </w:lvl>
+    <w:lvl w:ilvl="3" w:tplc="1C090001" w:tentative="1">
+      <w:start w:val="1"/>
+      <w:numFmt w:val="bullet"/>
+      <w:lvlText w:val=""/>
+      <w:lvlJc w:val="left"/>
+      <w:pPr>
+        <w:ind w:left="3960" w:hanging="360"/>
+      </w:pPr>
+      <w:rPr>
+        <w:rFonts w:ascii="Symbol" w:hAnsi="Symbol" w:hint="default"/>
+      </w:rPr>
+    </w:lvl>
+    <w:lvl w:ilvl="4" w:tplc="1C090003" w:tentative="1">
+      <w:start w:val="1"/>
+      <w:numFmt w:val="bullet"/>
+      <w:lvlText w:val="o"/>
+      <w:lvlJc w:val="left"/>
+      <w:pPr>
+        <w:ind w:left="4680" w:hanging="360"/>
+      </w:pPr>
+      <w:rPr>
+        <w:rFonts w:ascii="Courier New" w:hAnsi="Courier New" w:cs="Courier New" w:hint="default"/>
+      </w:rPr>
+    </w:lvl>
+    <w:lvl w:ilvl="5" w:tplc="1C090005" w:tentative="1">
+      <w:start w:val="1"/>
+      <w:numFmt w:val="bullet"/>
+      <w:lvlText w:val=""/>
+      <w:lvlJc w:val="left"/>
+      <w:pPr>
+        <w:ind w:left="5400" w:hanging="360"/>
+      </w:pPr>
+      <w:rPr>
+        <w:rFonts w:ascii="Wingdings" w:hAnsi="Wingdings" w:hint="default"/>
+      </w:rPr>
+    </w:lvl>
+    <w:lvl w:ilvl="6" w:tplc="1C090001" w:tentative="1">
+      <w:start w:val="1"/>
+      <w:numFmt w:val="bullet"/>
+      <w:lvlText w:val=""/>
+      <w:lvlJc w:val="left"/>
+      <w:pPr>
+        <w:ind w:left="6120" w:hanging="360"/>
+      </w:pPr>
+      <w:rPr>
+        <w:rFonts w:ascii="Symbol" w:hAnsi="Symbol" w:hint="default"/>
+      </w:rPr>
+    </w:lvl>
+    <w:lvl w:ilvl="7" w:tplc="1C090003" w:tentative="1">
+      <w:start w:val="1"/>
+      <w:numFmt w:val="bullet"/>
+      <w:lvlText w:val="o"/>
+      <w:lvlJc w:val="left"/>
+      <w:pPr>
+        <w:ind w:left="6840" w:hanging="360"/>
+      </w:pPr>
+      <w:rPr>
+        <w:rFonts w:ascii="Courier New" w:hAnsi="Courier New" w:cs="Courier New" w:hint="default"/>
+      </w:rPr>
+    </w:lvl>
+    <w:lvl w:ilvl="8" w:tplc="1C090005" w:tentative="1">
+      <w:start w:val="1"/>
+      <w:numFmt w:val="bullet"/>
+      <w:lvlText w:val=""/>
+      <w:lvlJc w:val="left"/>
+      <w:pPr>
+        <w:ind w:left="7560" w:hanging="360"/>
+      </w:pPr>
+      <w:rPr>
+        <w:rFonts w:ascii="Wingdings" w:hAnsi="Wingdings" w:hint="default"/>
+      </w:rPr>
+    </w:lvl>
+  </w:abstractNum>
+  <w:abstractNum w:abstractNumId="8" w15:restartNumberingAfterBreak="0">
     <w:nsid w:val="45DB384C"/>
     <w:multiLevelType w:val="hybridMultilevel"/>
     <w:tmpl w:val="39109AD8"/>
@@ -4111,7 +6458,7 @@
       </w:rPr>
     </w:lvl>
   </w:abstractNum>
-  <w:abstractNum w:abstractNumId="6" w15:restartNumberingAfterBreak="0">
+  <w:abstractNum w:abstractNumId="9" w15:restartNumberingAfterBreak="0">
     <w:nsid w:val="477929EE"/>
     <w:multiLevelType w:val="hybridMultilevel"/>
     <w:tmpl w:val="A7588B40"/>
@@ -4224,7 +6571,7 @@
       </w:rPr>
     </w:lvl>
   </w:abstractNum>
-  <w:abstractNum w:abstractNumId="7" w15:restartNumberingAfterBreak="0">
+  <w:abstractNum w:abstractNumId="10" w15:restartNumberingAfterBreak="0">
     <w:nsid w:val="48577DC0"/>
     <w:multiLevelType w:val="hybridMultilevel"/>
     <w:tmpl w:val="7382E2C2"/>
@@ -4310,7 +6657,120 @@
       </w:pPr>
     </w:lvl>
   </w:abstractNum>
-  <w:abstractNum w:abstractNumId="8" w15:restartNumberingAfterBreak="0">
+  <w:abstractNum w:abstractNumId="11" w15:restartNumberingAfterBreak="0">
+    <w:nsid w:val="4C6A31B7"/>
+    <w:multiLevelType w:val="hybridMultilevel"/>
+    <w:tmpl w:val="F5F2F416"/>
+    <w:lvl w:ilvl="0" w:tplc="1C090003">
+      <w:start w:val="1"/>
+      <w:numFmt w:val="bullet"/>
+      <w:lvlText w:val="o"/>
+      <w:lvlJc w:val="left"/>
+      <w:pPr>
+        <w:ind w:left="720" w:hanging="360"/>
+      </w:pPr>
+      <w:rPr>
+        <w:rFonts w:ascii="Courier New" w:hAnsi="Courier New" w:cs="Courier New" w:hint="default"/>
+      </w:rPr>
+    </w:lvl>
+    <w:lvl w:ilvl="1" w:tplc="1C090003">
+      <w:start w:val="1"/>
+      <w:numFmt w:val="bullet"/>
+      <w:lvlText w:val="o"/>
+      <w:lvlJc w:val="left"/>
+      <w:pPr>
+        <w:ind w:left="1440" w:hanging="360"/>
+      </w:pPr>
+      <w:rPr>
+        <w:rFonts w:ascii="Courier New" w:hAnsi="Courier New" w:cs="Courier New" w:hint="default"/>
+      </w:rPr>
+    </w:lvl>
+    <w:lvl w:ilvl="2" w:tplc="1C090005" w:tentative="1">
+      <w:start w:val="1"/>
+      <w:numFmt w:val="bullet"/>
+      <w:lvlText w:val=""/>
+      <w:lvlJc w:val="left"/>
+      <w:pPr>
+        <w:ind w:left="2160" w:hanging="360"/>
+      </w:pPr>
+      <w:rPr>
+        <w:rFonts w:ascii="Wingdings" w:hAnsi="Wingdings" w:hint="default"/>
+      </w:rPr>
+    </w:lvl>
+    <w:lvl w:ilvl="3" w:tplc="1C090001" w:tentative="1">
+      <w:start w:val="1"/>
+      <w:numFmt w:val="bullet"/>
+      <w:lvlText w:val=""/>
+      <w:lvlJc w:val="left"/>
+      <w:pPr>
+        <w:ind w:left="2880" w:hanging="360"/>
+      </w:pPr>
+      <w:rPr>
+        <w:rFonts w:ascii="Symbol" w:hAnsi="Symbol" w:hint="default"/>
+      </w:rPr>
+    </w:lvl>
+    <w:lvl w:ilvl="4" w:tplc="1C090003" w:tentative="1">
+      <w:start w:val="1"/>
+      <w:numFmt w:val="bullet"/>
+      <w:lvlText w:val="o"/>
+      <w:lvlJc w:val="left"/>
+      <w:pPr>
+        <w:ind w:left="3600" w:hanging="360"/>
+      </w:pPr>
+      <w:rPr>
+        <w:rFonts w:ascii="Courier New" w:hAnsi="Courier New" w:cs="Courier New" w:hint="default"/>
+      </w:rPr>
+    </w:lvl>
+    <w:lvl w:ilvl="5" w:tplc="1C090005" w:tentative="1">
+      <w:start w:val="1"/>
+      <w:numFmt w:val="bullet"/>
+      <w:lvlText w:val=""/>
+      <w:lvlJc w:val="left"/>
+      <w:pPr>
+        <w:ind w:left="4320" w:hanging="360"/>
+      </w:pPr>
+      <w:rPr>
+        <w:rFonts w:ascii="Wingdings" w:hAnsi="Wingdings" w:hint="default"/>
+      </w:rPr>
+    </w:lvl>
+    <w:lvl w:ilvl="6" w:tplc="1C090001" w:tentative="1">
+      <w:start w:val="1"/>
+      <w:numFmt w:val="bullet"/>
+      <w:lvlText w:val=""/>
+      <w:lvlJc w:val="left"/>
+      <w:pPr>
+        <w:ind w:left="5040" w:hanging="360"/>
+      </w:pPr>
+      <w:rPr>
+        <w:rFonts w:ascii="Symbol" w:hAnsi="Symbol" w:hint="default"/>
+      </w:rPr>
+    </w:lvl>
+    <w:lvl w:ilvl="7" w:tplc="1C090003" w:tentative="1">
+      <w:start w:val="1"/>
+      <w:numFmt w:val="bullet"/>
+      <w:lvlText w:val="o"/>
+      <w:lvlJc w:val="left"/>
+      <w:pPr>
+        <w:ind w:left="5760" w:hanging="360"/>
+      </w:pPr>
+      <w:rPr>
+        <w:rFonts w:ascii="Courier New" w:hAnsi="Courier New" w:cs="Courier New" w:hint="default"/>
+      </w:rPr>
+    </w:lvl>
+    <w:lvl w:ilvl="8" w:tplc="1C090005" w:tentative="1">
+      <w:start w:val="1"/>
+      <w:numFmt w:val="bullet"/>
+      <w:lvlText w:val=""/>
+      <w:lvlJc w:val="left"/>
+      <w:pPr>
+        <w:ind w:left="6480" w:hanging="360"/>
+      </w:pPr>
+      <w:rPr>
+        <w:rFonts w:ascii="Wingdings" w:hAnsi="Wingdings" w:hint="default"/>
+      </w:rPr>
+    </w:lvl>
+  </w:abstractNum>
+  <w:abstractNum w:abstractNumId="12" w15:restartNumberingAfterBreak="0">
     <w:nsid w:val="56B1036F"/>
     <w:multiLevelType w:val="multilevel"/>
     <w:tmpl w:val="D6A05FE4"/>
@@ -4459,7 +6919,7 @@
       </w:rPr>
     </w:lvl>
   </w:abstractNum>
-  <w:abstractNum w:abstractNumId="9" w15:restartNumberingAfterBreak="0">
+  <w:abstractNum w:abstractNumId="13" w15:restartNumberingAfterBreak="0">
     <w:nsid w:val="5DBE7BFF"/>
     <w:multiLevelType w:val="multilevel"/>
     <w:tmpl w:val="D6A05FE4"/>
@@ -4608,7 +7068,7 @@
       </w:rPr>
     </w:lvl>
   </w:abstractNum>
-  <w:abstractNum w:abstractNumId="10" w15:restartNumberingAfterBreak="0">
+  <w:abstractNum w:abstractNumId="14" w15:restartNumberingAfterBreak="0">
     <w:nsid w:val="6E0D47B3"/>
     <w:multiLevelType w:val="hybridMultilevel"/>
     <w:tmpl w:val="29120D22"/>
@@ -4721,7 +7181,7 @@
       </w:rPr>
     </w:lvl>
   </w:abstractNum>
-  <w:abstractNum w:abstractNumId="11" w15:restartNumberingAfterBreak="0">
+  <w:abstractNum w:abstractNumId="15" w15:restartNumberingAfterBreak="0">
     <w:nsid w:val="713A11E9"/>
     <w:multiLevelType w:val="multilevel"/>
     <w:tmpl w:val="D6A05FE4"/>
@@ -4870,7 +7330,7 @@
       </w:rPr>
     </w:lvl>
   </w:abstractNum>
-  <w:abstractNum w:abstractNumId="12" w15:restartNumberingAfterBreak="0">
+  <w:abstractNum w:abstractNumId="16" w15:restartNumberingAfterBreak="0">
     <w:nsid w:val="725A2A62"/>
     <w:multiLevelType w:val="hybridMultilevel"/>
     <w:tmpl w:val="A42A5048"/>
@@ -4983,7 +7443,7 @@
       </w:rPr>
     </w:lvl>
   </w:abstractNum>
-  <w:abstractNum w:abstractNumId="13" w15:restartNumberingAfterBreak="0">
+  <w:abstractNum w:abstractNumId="17" w15:restartNumberingAfterBreak="0">
     <w:nsid w:val="79877E13"/>
     <w:multiLevelType w:val="multilevel"/>
     <w:tmpl w:val="276EFC8A"/>
@@ -5128,7 +7588,7 @@
       </w:rPr>
     </w:lvl>
   </w:abstractNum>
-  <w:abstractNum w:abstractNumId="14" w15:restartNumberingAfterBreak="0">
+  <w:abstractNum w:abstractNumId="18" w15:restartNumberingAfterBreak="0">
     <w:nsid w:val="7A770374"/>
     <w:multiLevelType w:val="multilevel"/>
     <w:tmpl w:val="276EFC8A"/>
@@ -5273,7 +7733,7 @@
       </w:rPr>
     </w:lvl>
   </w:abstractNum>
-  <w:abstractNum w:abstractNumId="15" w15:restartNumberingAfterBreak="0">
+  <w:abstractNum w:abstractNumId="19" w15:restartNumberingAfterBreak="0">
     <w:nsid w:val="7DFE4F17"/>
     <w:multiLevelType w:val="hybridMultilevel"/>
     <w:tmpl w:val="D5F0F3E6"/>
@@ -5386,7 +7846,120 @@
       </w:rPr>
     </w:lvl>
   </w:abstractNum>
-  <w:abstractNum w:abstractNumId="16" w15:restartNumberingAfterBreak="0">
+  <w:abstractNum w:abstractNumId="20" w15:restartNumberingAfterBreak="0">
+    <w:nsid w:val="7F1F1F55"/>
+    <w:multiLevelType w:val="hybridMultilevel"/>
+    <w:tmpl w:val="51303106"/>
+    <w:lvl w:ilvl="0" w:tplc="1C090001">
+      <w:start w:val="1"/>
+      <w:numFmt w:val="bullet"/>
+      <w:lvlText w:val=""/>
+      <w:lvlJc w:val="left"/>
+      <w:pPr>
+        <w:ind w:left="1440" w:hanging="360"/>
+      </w:pPr>
+      <w:rPr>
+        <w:rFonts w:ascii="Symbol" w:hAnsi="Symbol" w:hint="default"/>
+      </w:rPr>
+    </w:lvl>
+    <w:lvl w:ilvl="1" w:tplc="1C090003" w:tentative="1">
+      <w:start w:val="1"/>
+      <w:numFmt w:val="bullet"/>
+      <w:lvlText w:val="o"/>
+      <w:lvlJc w:val="left"/>
+      <w:pPr>
+        <w:ind w:left="2160" w:hanging="360"/>
+      </w:pPr>
+      <w:rPr>
+        <w:rFonts w:ascii="Courier New" w:hAnsi="Courier New" w:cs="Courier New" w:hint="default"/>
+      </w:rPr>
+    </w:lvl>
+    <w:lvl w:ilvl="2" w:tplc="1C090005" w:tentative="1">
+      <w:start w:val="1"/>
+      <w:numFmt w:val="bullet"/>
+      <w:lvlText w:val=""/>
+      <w:lvlJc w:val="left"/>
+      <w:pPr>
+        <w:ind w:left="2880" w:hanging="360"/>
+      </w:pPr>
+      <w:rPr>
+        <w:rFonts w:ascii="Wingdings" w:hAnsi="Wingdings" w:hint="default"/>
+      </w:rPr>
+    </w:lvl>
+    <w:lvl w:ilvl="3" w:tplc="1C090001" w:tentative="1">
+      <w:start w:val="1"/>
+      <w:numFmt w:val="bullet"/>
+      <w:lvlText w:val=""/>
+      <w:lvlJc w:val="left"/>
+      <w:pPr>
+        <w:ind w:left="3600" w:hanging="360"/>
+      </w:pPr>
+      <w:rPr>
+        <w:rFonts w:ascii="Symbol" w:hAnsi="Symbol" w:hint="default"/>
+      </w:rPr>
+    </w:lvl>
+    <w:lvl w:ilvl="4" w:tplc="1C090003" w:tentative="1">
+      <w:start w:val="1"/>
+      <w:numFmt w:val="bullet"/>
+      <w:lvlText w:val="o"/>
+      <w:lvlJc w:val="left"/>
+      <w:pPr>
+        <w:ind w:left="4320" w:hanging="360"/>
+      </w:pPr>
+      <w:rPr>
+        <w:rFonts w:ascii="Courier New" w:hAnsi="Courier New" w:cs="Courier New" w:hint="default"/>
+      </w:rPr>
+    </w:lvl>
+    <w:lvl w:ilvl="5" w:tplc="1C090005" w:tentative="1">
+      <w:start w:val="1"/>
+      <w:numFmt w:val="bullet"/>
+      <w:lvlText w:val=""/>
+      <w:lvlJc w:val="left"/>
+      <w:pPr>
+        <w:ind w:left="5040" w:hanging="360"/>
+      </w:pPr>
+      <w:rPr>
+        <w:rFonts w:ascii="Wingdings" w:hAnsi="Wingdings" w:hint="default"/>
+      </w:rPr>
+    </w:lvl>
+    <w:lvl w:ilvl="6" w:tplc="1C090001" w:tentative="1">
+      <w:start w:val="1"/>
+      <w:numFmt w:val="bullet"/>
+      <w:lvlText w:val=""/>
+      <w:lvlJc w:val="left"/>
+      <w:pPr>
+        <w:ind w:left="5760" w:hanging="360"/>
+      </w:pPr>
+      <w:rPr>
+        <w:rFonts w:ascii="Symbol" w:hAnsi="Symbol" w:hint="default"/>
+      </w:rPr>
+    </w:lvl>
+    <w:lvl w:ilvl="7" w:tplc="1C090003" w:tentative="1">
+      <w:start w:val="1"/>
+      <w:numFmt w:val="bullet"/>
+      <w:lvlText w:val="o"/>
+      <w:lvlJc w:val="left"/>
+      <w:pPr>
+        <w:ind w:left="6480" w:hanging="360"/>
+      </w:pPr>
+      <w:rPr>
+        <w:rFonts w:ascii="Courier New" w:hAnsi="Courier New" w:cs="Courier New" w:hint="default"/>
+      </w:rPr>
+    </w:lvl>
+    <w:lvl w:ilvl="8" w:tplc="1C090005" w:tentative="1">
+      <w:start w:val="1"/>
+      <w:numFmt w:val="bullet"/>
+      <w:lvlText w:val=""/>
+      <w:lvlJc w:val="left"/>
+      <w:pPr>
+        <w:ind w:left="7200" w:hanging="360"/>
+      </w:pPr>
+      <w:rPr>
+        <w:rFonts w:ascii="Wingdings" w:hAnsi="Wingdings" w:hint="default"/>
+      </w:rPr>
+    </w:lvl>
+  </w:abstractNum>
+  <w:abstractNum w:abstractNumId="21" w15:restartNumberingAfterBreak="0">
     <w:nsid w:val="7F2E6B21"/>
     <w:multiLevelType w:val="hybridMultilevel"/>
     <w:tmpl w:val="5A4A56CC"/>
@@ -5500,10 +8073,10 @@
     </w:lvl>
   </w:abstractNum>
   <w:num w:numId="1" w16cid:durableId="1413235374">
-    <w:abstractNumId w:val="7"/>
+    <w:abstractNumId w:val="10"/>
   </w:num>
   <w:num w:numId="2" w16cid:durableId="1285115221">
-    <w:abstractNumId w:val="16"/>
+    <w:abstractNumId w:val="21"/>
   </w:num>
   <w:num w:numId="3" w16cid:durableId="143010213">
     <w:abstractNumId w:val="1"/>
@@ -5512,43 +8085,58 @@
     <w:abstractNumId w:val="0"/>
   </w:num>
   <w:num w:numId="5" w16cid:durableId="1245073293">
-    <w:abstractNumId w:val="11"/>
+    <w:abstractNumId w:val="15"/>
   </w:num>
   <w:num w:numId="6" w16cid:durableId="899169806">
+    <w:abstractNumId w:val="4"/>
+  </w:num>
+  <w:num w:numId="7" w16cid:durableId="1826781170">
+    <w:abstractNumId w:val="12"/>
+  </w:num>
+  <w:num w:numId="8" w16cid:durableId="941574356">
+    <w:abstractNumId w:val="13"/>
+  </w:num>
+  <w:num w:numId="9" w16cid:durableId="548348385">
+    <w:abstractNumId w:val="17"/>
+  </w:num>
+  <w:num w:numId="10" w16cid:durableId="504976459">
     <w:abstractNumId w:val="3"/>
   </w:num>
-  <w:num w:numId="7" w16cid:durableId="1826781170">
+  <w:num w:numId="11" w16cid:durableId="442653361">
+    <w:abstractNumId w:val="18"/>
+  </w:num>
+  <w:num w:numId="12" w16cid:durableId="1643803246">
     <w:abstractNumId w:val="8"/>
   </w:num>
-  <w:num w:numId="8" w16cid:durableId="941574356">
+  <w:num w:numId="13" w16cid:durableId="485436170">
     <w:abstractNumId w:val="9"/>
   </w:num>
-  <w:num w:numId="9" w16cid:durableId="548348385">
-    <w:abstractNumId w:val="13"/>
+  <w:num w:numId="14" w16cid:durableId="834494500">
+    <w:abstractNumId w:val="19"/>
   </w:num>
-  <w:num w:numId="10" w16cid:durableId="504976459">
+  <w:num w:numId="15" w16cid:durableId="1032533872">
+    <w:abstractNumId w:val="16"/>
+  </w:num>
+  <w:num w:numId="16" w16cid:durableId="745419047">
+    <w:abstractNumId w:val="14"/>
+  </w:num>
+  <w:num w:numId="17" w16cid:durableId="1882128701">
+    <w:abstractNumId w:val="5"/>
+  </w:num>
+  <w:num w:numId="18" w16cid:durableId="2080443093">
+    <w:abstractNumId w:val="6"/>
+  </w:num>
+  <w:num w:numId="19" w16cid:durableId="1664703578">
+    <w:abstractNumId w:val="7"/>
+  </w:num>
+  <w:num w:numId="20" w16cid:durableId="1113402620">
+    <w:abstractNumId w:val="20"/>
+  </w:num>
+  <w:num w:numId="21" w16cid:durableId="675764940">
     <w:abstractNumId w:val="2"/>
   </w:num>
-  <w:num w:numId="11" w16cid:durableId="442653361">
-    <w:abstractNumId w:val="14"/>
-  </w:num>
-  <w:num w:numId="12" w16cid:durableId="1643803246">
-    <w:abstractNumId w:val="5"/>
-  </w:num>
-  <w:num w:numId="13" w16cid:durableId="485436170">
-    <w:abstractNumId w:val="6"/>
-  </w:num>
-  <w:num w:numId="14" w16cid:durableId="834494500">
-    <w:abstractNumId w:val="15"/>
-  </w:num>
-  <w:num w:numId="15" w16cid:durableId="1032533872">
-    <w:abstractNumId w:val="12"/>
-  </w:num>
-  <w:num w:numId="16" w16cid:durableId="745419047">
-    <w:abstractNumId w:val="10"/>
-  </w:num>
-  <w:num w:numId="17" w16cid:durableId="1882128701">
-    <w:abstractNumId w:val="4"/>
+  <w:num w:numId="22" w16cid:durableId="1560284592">
+    <w:abstractNumId w:val="11"/>
   </w:num>
 </w:numbering>
 </file>
@@ -5981,7 +8569,6 @@
     <w:next w:val="Normal"/>
     <w:link w:val="Heading2Char"/>
     <w:uiPriority w:val="9"/>
-    <w:semiHidden/>
     <w:unhideWhenUsed/>
     <w:qFormat/>
     <w:rsid w:val="008A604E"/>
@@ -6198,7 +8785,6 @@
     <w:basedOn w:val="DefaultParagraphFont"/>
     <w:link w:val="Heading2"/>
     <w:uiPriority w:val="9"/>
-    <w:semiHidden/>
     <w:rsid w:val="008A604E"/>
     <w:rPr>
       <w:rFonts w:asciiTheme="majorHAnsi" w:eastAsiaTheme="majorEastAsia" w:hAnsiTheme="majorHAnsi" w:cstheme="majorBidi"/>
@@ -6488,6 +9074,39 @@
         <w:insideV w:val="single" w:sz="4" w:space="0" w:color="auto"/>
       </w:tblBorders>
     </w:tblPr>
+  </w:style>
+  <w:style w:type="paragraph" w:styleId="NoSpacing">
+    <w:name w:val="No Spacing"/>
+    <w:link w:val="NoSpacingChar"/>
+    <w:uiPriority w:val="1"/>
+    <w:qFormat/>
+    <w:rsid w:val="00BC577C"/>
+    <w:pPr>
+      <w:spacing w:after="0" w:line="240" w:lineRule="auto"/>
+    </w:pPr>
+    <w:rPr>
+      <w:rFonts w:eastAsiaTheme="minorEastAsia"/>
+      <w:kern w:val="0"/>
+      <w:sz w:val="22"/>
+      <w:szCs w:val="22"/>
+      <w:lang w:val="en-US"/>
+      <w14:ligatures w14:val="none"/>
+    </w:rPr>
+  </w:style>
+  <w:style w:type="character" w:customStyle="1" w:styleId="NoSpacingChar">
+    <w:name w:val="No Spacing Char"/>
+    <w:basedOn w:val="DefaultParagraphFont"/>
+    <w:link w:val="NoSpacing"/>
+    <w:uiPriority w:val="1"/>
+    <w:rsid w:val="00BC577C"/>
+    <w:rPr>
+      <w:rFonts w:eastAsiaTheme="minorEastAsia"/>
+      <w:kern w:val="0"/>
+      <w:sz w:val="22"/>
+      <w:szCs w:val="22"/>
+      <w:lang w:val="en-US"/>
+      <w14:ligatures w14:val="none"/>
+    </w:rPr>
   </w:style>
 </w:styles>
 </file>
@@ -6805,4 +9424,23 @@
     </a:ext>
   </a:extLst>
 </a:theme>
+</file>
+
+<file path=customXml/item1.xml><?xml version="1.0" encoding="utf-8"?>
+<CoverPageProperties xmlns="http://schemas.microsoft.com/office/2006/coverPageProps">
+  <PublishDate>MTP</PublishDate>
+  <Abstract/>
+  <CompanyAddress>23 Oxford Road, Overseas</CompanyAddress>
+  <CompanyPhone/>
+  <CompanyFax/>
+  <CompanyEmail/>
+</CoverPageProperties>
+</file>
+
+<file path=customXml/itemProps1.xml><?xml version="1.0" encoding="utf-8"?>
+<ds:datastoreItem xmlns:ds="http://schemas.openxmlformats.org/officeDocument/2006/customXml" ds:itemID="{55AF091B-3C7A-41E3-B477-F2FDAA23CFDA}">
+  <ds:schemaRefs>
+    <ds:schemaRef ds:uri="http://schemas.microsoft.com/office/2006/coverPageProps"/>
+  </ds:schemaRefs>
+</ds:datastoreItem>
 </file>
</xml_diff>